<commit_message>
Prepare KBS short communication for submission.
</commit_message>
<xml_diff>
--- a/paper/KBS_short_communication.docx
+++ b/paper/KBS_short_communication.docx
@@ -16,7 +16,7 @@
           <w:color w:val="000000"/>
           <w:sz w:val="28"/>
         </w:rPr>
-        <w:t>Knowledge-Guided Decision Intelligence for Cost-Aware Customer Churn Intervention Under Predictive Uncertainty</w:t>
+        <w:t>Knowledge-Guided Decision Intelligence for Strategic-Value-Aware Customer Churn Intervention Under Budget Constraints</w:t>
       </w:r>
     </w:p>
     <w:p>
@@ -50,12 +50,12 @@
           <w:color w:val="000000"/>
           <w:sz w:val="24"/>
         </w:rPr>
-        <w:t>Dr. Sai Krishna Thota, PhD</w:t>
+        <w:t>Dr. Sai Krishna Thota, PhD*</w:t>
       </w:r>
     </w:p>
     <w:p>
       <w:pPr>
-        <w:spacing w:after="360" w:before="0" w:lineRule="auto" w:line="480"/>
+        <w:spacing w:after="0" w:before="0" w:lineRule="auto" w:line="480"/>
         <w:ind w:firstLine="0"/>
         <w:jc w:val="center"/>
       </w:pPr>
@@ -67,13 +67,30 @@
           <w:color w:val="000000"/>
           <w:sz w:val="24"/>
         </w:rPr>
-        <w:t>Independent Researcher, USA</w:t>
+        <w:t>Independent Researcher, United States</w:t>
+      </w:r>
+    </w:p>
+    <w:p>
+      <w:pPr>
+        <w:spacing w:after="240" w:before="0" w:lineRule="auto" w:line="276"/>
+        <w:ind w:firstLine="0"/>
+        <w:jc w:val="center"/>
+      </w:pPr>
+      <w:r>
+        <w:rPr>
+          <w:rFonts w:ascii="Times New Roman" w:hAnsi="Times New Roman" w:eastAsia="Times New Roman"/>
+          <w:b w:val="0"/>
+          <w:i/>
+          <w:color w:val="000000"/>
+          <w:sz w:val="22"/>
+        </w:rPr>
+        <w:t>* Corresponding author. E-mail: drsaikrishnathota@ieee.org</w:t>
       </w:r>
     </w:p>
     <w:p>
       <w:pPr>
         <w:pStyle w:val="Heading1"/>
-        <w:spacing w:lineRule="auto" w:line="480" w:after="0" w:before="240"/>
+        <w:spacing w:lineRule="auto" w:line="480" w:after="0" w:before="120"/>
       </w:pPr>
       <w:r>
         <w:rPr>
@@ -100,7 +117,7 @@
           <w:color w:val="000000"/>
           <w:sz w:val="24"/>
         </w:rPr>
-        <w:t>Customer churn scores are often treated as if they were already an intervention policy. Existing studies largely optimise prediction or expected profit, while calibrated risk, structured domain knowledge, strategic customer value, predictive uncertainty, human review, and a shared budget are rarely treated as one constrained decision problem. This short communication places a leakage-safe calibrated ensemble under a knowledge-guided allocation layer. A service-contract graph supplies out-of-fold motif risk. IBM customer lifetime value (CLTV) is a dimensionless strategic-priority index; simulated annual margin from monthly charges is the economic value in the utility. Under a common expected-cost budget, most spend goes to positive expected-utility offers and a minority is reserved for human review of high-CLTV cases. On IBM Telco data (N = 7043), ensemble AUROC is 0.860 ± 0.001 and expected calibration error is 0.012 ± 0.003. The prespecified primary decision endpoint is high-value churn reach. Versus cost-aware targeting it rises by 12.6 percentage points (1000/1000 paired bootstrap resamples positive; 95% interval [9.3, 16.5] pp). Overall churn reach stays comparable. The net-benefit proxy rises by $2320 (968/1000 resamples positive; 95% interval [-$92, $5397]) and is not claimed as confirmed economic superiority. Component ablation shows that this coverage gain is produced by the reserved high-CLTV review slice, not by incremental graph-residual routing at the nominal 85/15 operating point. The contribution is a constrained decision-support procedure, not a new classifier.</w:t>
+        <w:t>Customer churn scores are often treated as if they were already intervention policies. Existing prescriptive churn methods primarily optimise economic targeting or incentives, while strategic customer-value coverage and scarce human review are less often integrated under a shared budget. This short communication develops a leakage-safe calibrated ensemble with a budget-constrained decision layer. Knowledge guidance is operationalised mainly through customer lifetime value (CLTV) and explicit review constraints; a service-contract graph is an auxiliary structural diagnostic. On IBM Telco data (N = 7043), ensemble AUROC is 0.860 ± 0.001 and expected calibration error is 0.012 ± 0.003. Under a common expected-cost budget, the nominal 85/15 strategic-review policy reaches 56.4% of high-value churners versus 43.8% for cost-aware targeting (+12.6 percentage points; 1000/1000 paired bootstrap resamples positive; 95% interval [9.3, 16.5] pp). A matched CLTV-reserved offer-only policy reaches only 44.1%. A post hoc mechanism bootstrap attributes a 12.3 percentage-point gain to review routing (95% interval [8.8, 15.6] pp). The corresponding net-benefit difference is +$2372, but its 95% interval [-$149, $4875] includes zero. Ablation attributes the coverage gain to the high-CLTV review reserve; entropy and graph-residual gates are non-binding at the nominal point. An exact epsilon-constraint benchmark achieves the same strategic reach while retaining 99.68% of the utility optimum versus 93.02% for the fixed-share heuristic. The contribution is a decision-support architecture that separates strategic coverage from economic utility and quantifies the efficiency cost of a simple operational heuristic.</w:t>
       </w:r>
     </w:p>
     <w:p>
@@ -127,13 +144,13 @@
           <w:color w:val="000000"/>
           <w:sz w:val="24"/>
         </w:rPr>
-        <w:t>churn prediction; decision support; knowledge graph; predictive uncertainty; cost-sensitive learning; human-in-the-loop</w:t>
+        <w:t>churn prediction; decision intelligence; strategic customer value; budget-constrained allocation; human-in-the-loop; knowledge-guided decision support</w:t>
       </w:r>
     </w:p>
     <w:p>
       <w:pPr>
         <w:pStyle w:val="Heading1"/>
-        <w:spacing w:lineRule="auto" w:line="480" w:after="0" w:before="240"/>
+        <w:spacing w:lineRule="auto" w:line="480" w:after="0" w:before="120"/>
       </w:pPr>
       <w:r>
         <w:rPr>
@@ -160,7 +177,7 @@
           <w:color w:val="000000"/>
           <w:sz w:val="24"/>
         </w:rPr>
-        <w:t>Recent surveys of machine-learning churn research show that predictive pipelines are mature, yet profit-oriented evaluation, operational allocation, and explainable decision support remain comparatively thin [1,2]. Ensemble and boosting classifiers dominate published benchmarks [2,9,10]. Profit-driven ensembles and prescriptive methods that trade expected profit against discrimination, including heterogeneous lifetime value and incentive cost, improve monetary scores relative to accuracy-only training [4,5]. Probability calibration is required if those scores are to be used as decision inputs [11]. Human inspection belongs inside a decision-support system rather than as an afterthought [12]. Knowledge bases and graphs have been used to enrich churn features [3] and, in other domains, to support structured decision-making [13,14].</w:t>
+        <w:t>Recent surveys of machine-learning churn research show that predictive pipelines are mature, yet profit-oriented evaluation, operational allocation, and explainable decision support remain comparatively thin [1,2]. Ensemble and boosting classifiers dominate published benchmarks [2,9,10], while profit-driven and prescriptive approaches improve monetary criteria and can account for heterogeneous lifetime value or incentive cost [4,5]. Prediction-to-retention-policy integration itself is not new: Chu et al. [15] proposed a hybrid churn-and-policy architecture, and recent Knowledge-Based Systems work has developed explainable decision support for strategic customer development [16]. Most directly, Latorre et al. [17] jointly optimise retention targeting and incentive level for profit in a predictor-agnostic prescriptive layer. Probability calibration is required when scores are used as decision inputs [11], and human inspection belongs inside a decision-support system rather than as an afterthought [12]. Knowledge bases and graphs have also been used to enrich churn features [3] and to support structured decisions in other domains [13,14].</w:t>
       </w:r>
     </w:p>
     <w:p>
@@ -177,7 +194,7 @@
           <w:color w:val="000000"/>
           <w:sz w:val="24"/>
         </w:rPr>
-        <w:t>The scientific gap is more specific than better churn AUROC. Existing work largely optimises prediction or expected profit in isolation. Comparatively little work treats calibrated risk, structured domain knowledge, strategic customer value, predictive uncertainty, scarce human review, and a shared intervention budget as one constrained decision problem. Two operational facts make that joint problem necessary. First, economic targeting based on monthly charges is not equivalent to strategic targeting based on lifetime-value knowledge: in the IBM Telco workbook, CLTV and the simulated annual-margin proxy have Pearson correlation 0.10. Second, converting predictive entropy into a blanket review rule can consume the budget with cheap reviews and leave too little capacity for high-utility offers.</w:t>
+        <w:t>The scientific gap is therefore not another increment in churn AUROC, nor simply the move from prediction to policy. Existing prescriptive churn work primarily optimises economic targeting and incentives [4,5,15,17]. Comparatively little work formulates strategic customer-value coverage and economic utility as non-identical objectives under a shared budget with scarce human review. Two operational facts motivate that formulation. First, economic targeting based on monthly charges is not equivalent to strategic targeting based on lifetime-value knowledge: in the IBM Telco workbook, CLTV and the simulated annual-margin proxy have Pearson correlation 0.10. Second, routing every uncertain case to review can consume budget without improving strategic allocation.</w:t>
       </w:r>
     </w:p>
     <w:p>
@@ -194,13 +211,13 @@
           <w:color w:val="000000"/>
           <w:sz w:val="24"/>
         </w:rPr>
-        <w:t>This short communication therefore separates prediction from allocation. A calibrated ensemble estimates churn probability. A compact service-contract graph and CLTV encode domain structure. The proposed knowledge-guided decision intelligence (KGDI) policy is budget-matched: majority economic allocation plus a reserved review slice for high-CLTV customers. High-value churn reach under that shared budget is the primary decision endpoint. Overall churn reach and an outcome-anchored net-benefit proxy are secondary. The 12.6 percentage-point coverage gain is interpreted as achievement of that intended strategic objective, not as unexpected discovery of a superior classifier. Only two tables and two figures are reported.</w:t>
+        <w:t>This short communication separates prediction from allocation. A calibrated ensemble estimates churn probability. CLTV supplies strategic-value knowledge, while a compact service-contract graph provides an auxiliary fold-local structural diagnostic. Here, "knowledge-guided" refers primarily to CLTV and explicit operational constraints; the graph is not claimed as the source of the primary allocation gain. The proposed knowledge-guided decision intelligence (KGDI) policy combines majority economic allocation with a minority review reserve for high-value customers. High-value churn reach under a shared expected-cost budget is the main strategic endpoint; overall churn reach and an outcome-anchored net-benefit proxy are secondary. Because the policy uses the same CLTV quantile that defines high-value evaluation, the coverage result is achievement of an intended objective rather than discovery of a hidden segment. A matched CLTV-reserved offer-only comparator and an exact efficiency benchmark test mechanism and efficiency. Only two tables and two figures are reported.</w:t>
       </w:r>
     </w:p>
     <w:p>
       <w:pPr>
         <w:pStyle w:val="Heading1"/>
-        <w:spacing w:lineRule="auto" w:line="480" w:after="0" w:before="240"/>
+        <w:spacing w:lineRule="auto" w:line="480" w:after="0" w:before="120"/>
       </w:pPr>
       <w:r>
         <w:rPr>
@@ -216,7 +233,7 @@
     <w:p>
       <w:pPr>
         <w:pStyle w:val="Heading2"/>
-        <w:spacing w:lineRule="auto" w:line="480" w:after="0" w:before="160"/>
+        <w:spacing w:lineRule="auto" w:line="480" w:after="0" w:before="80"/>
       </w:pPr>
       <w:r>
         <w:rPr>
@@ -243,13 +260,13 @@
           <w:color w:val="000000"/>
           <w:sz w:val="24"/>
         </w:rPr>
-        <w:t>Leakage-safe repeated stratified out-of-fold prediction is used (5 folds × 5 repeats). Predictors are an allowlist of service, contract, billing, and tenure fields. Direct leakage fields (churn label, churn score, churn reason) are excluded. Gender and senior-citizen status are excluded from the model and from the policy. Logistic regression, random forest, XGBoost, and LightGBM are calibrated with a sigmoid map fitted on a dedicated calibration split inside each training fold [11]. The ensemble probability pᵢ is the equal-weight mean of the four calibrated probabilities. Primary uncertainty is the normalised binary entropy of pᵢ. Between-model disagreement is retained only as a diagnostic. No synthetic oversampling is applied; imbalance is handled through cost-aware utilities [6-8]. Ranking and calibration, not F1, feed Eqs. (1)-(2).</w:t>
+        <w:t>Leakage-safe repeated stratified out-of-fold prediction is used (5 folds × 5 repeats). Predictors are restricted to an explicit allowlist of service, contract, billing, and tenure fields. Direct leakage fields (churn label, churn score, churn reason) are excluded; gender and senior-citizen status are excluded from the model and policy and retained only for audit. Logistic regression, random forest, XGBoost, and LightGBM are calibrated with a sigmoid map fitted on a dedicated calibration split inside each training fold [11]. The ensemble probability pᵢ is the equal-weight mean of the four calibrated probabilities. Normalised binary entropy of pᵢ is the primary uncertainty signal; between-model disagreement is retained only as a diagnostic. No synthetic oversampling is applied; imbalance is handled through cost-aware utilities [6-8]. Ranking and calibration, not F1, feed the decision equations.</w:t>
       </w:r>
     </w:p>
     <w:p>
       <w:pPr>
         <w:pStyle w:val="Heading2"/>
-        <w:spacing w:lineRule="auto" w:line="480" w:after="0" w:before="160"/>
+        <w:spacing w:lineRule="auto" w:line="480" w:after="0" w:before="80"/>
       </w:pPr>
       <w:r>
         <w:rPr>
@@ -276,7 +293,7 @@
           <w:color w:val="000000"/>
           <w:sz w:val="24"/>
         </w:rPr>
-        <w:t>A heterogeneous service-contract graph is built from observed IBM fields. Customer nodes link to contract type, internet service, payment method, and add-on or protection services. Motifs were specified from service-contract semantics that are standard in telecommunications operations-month-to-month fibre, electronic-check payment, unprotected internet, and short tenure-before fold-local rate estimation. They were not selected by scanning outcome labels on the full file. One-hop knowledge risk kᵢ for a held-out customer is the training-fold empirical churn rate of incident motifs, averaged out-of-fold. Test-fold labels never enter motif rates. Knowledge risk is a structural prior (AUROC 0.81) rather than a replacement for the ensemble (AUROC 0.86; correlation of kᵢ with pᵢ = 0.76). The residual kᵢ − pᵢ is available as an optional routing flag. This construction is a domain graph for decision gating, not an industrial ontology, a large language-model knowledge base, or a graph-reasoning engine [3,13,14]. Related work on assembling and reusing structured relations in other domains is cited only for that limited precedent [15-20].</w:t>
+        <w:t>A heterogeneous service-contract graph is built from observed IBM fields. Customer nodes link to contract type, internet service, payment method, and add-on or protection services. Motifs were specified from service-contract semantics-month-to-month fibre, electronic-check payment, unprotected internet, and short tenure-before fold-local rate estimation; they were not selected by scanning full-dataset outcomes. One-hop knowledge risk kᵢ for a held-out customer is the training-fold empirical churn rate of incident motifs, averaged out-of-fold. Test-fold labels never enter motif rates. Knowledge risk is a structural prior (AUROC 0.81) rather than a replacement for the ensemble (AUROC 0.86; correlation of kᵢ with pᵢ = 0.76). The residual kᵢ − pᵢ is an optional routing diagnostic; no incremental effect is assumed a priori. This construction is a compact domain graph, not an industrial ontology or graph-reasoning engine [3,13,14].</w:t>
       </w:r>
     </w:p>
     <w:p>
@@ -299,7 +316,7 @@
     <w:p>
       <w:pPr>
         <w:pStyle w:val="Heading2"/>
-        <w:spacing w:lineRule="auto" w:line="480" w:after="0" w:before="160"/>
+        <w:spacing w:lineRule="auto" w:line="480" w:after="0" w:before="80"/>
       </w:pPr>
       <w:r>
         <w:rPr>
@@ -343,7 +360,7 @@
           <w:color w:val="000000"/>
           <w:sz w:val="24"/>
         </w:rPr>
-        <w:t>Uᵢ^offer = pᵢ s Vᵢ − cₒ,                                            (1)</w:t>
+        <w:t>Uᵢ^offer = pᵢ s Vᵢ − cₒ                                              (1)</w:t>
       </w:r>
     </w:p>
     <w:p>
@@ -360,7 +377,7 @@
           <w:color w:val="000000"/>
           <w:sz w:val="24"/>
         </w:rPr>
-        <w:t>Uᵢ^review = pᵢ Se s Vᵢ − (cₕ + cₒ [pᵢ Se + (1 − pᵢ)(1 − Sp)]).     (2)</w:t>
+        <w:t>Uᵢ^review = pᵢ Se s Vᵢ − (cₕ + cₒ [pᵢ Se + (1 − pᵢ)(1 − Sp)])     (2)</w:t>
       </w:r>
     </w:p>
     <w:p>
@@ -377,7 +394,7 @@
           <w:color w:val="000000"/>
           <w:sz w:val="24"/>
         </w:rPr>
-        <w:t>The planning budget is B = N cₒ × 0.20 and is enforced on ex-ante expected selected cost. Three baselines receive the same B: (i) probability-threshold ranking among pᵢ ≥ 0.5; (ii) cost-aware greedy ranking by Uᵢ^offer among pᵢ ≥ 0.20 and Uᵢ^offer &gt; 0; (iii) uncertainty review, which routes high-entropy eligible customers to human review and otherwise offers [4,5,12].</w:t>
+        <w:t>A reviewed true churner proceeds to a retention offer with probability Se, whereas a reviewed non-churner receives an unnecessary follow-up offer with probability 1 − Sp; expected review cost therefore includes the review cost and the probability-weighted downstream offer cost. The planning budget is B = N cₒ × 0.20 and is enforced on ex-ante expected selected cost. Three primary baselines receive the same B: (i) probability-threshold ranking among pᵢ ≥ 0.5; (ii) cost-aware greedy ranking by expected offer utility among pᵢ ≥ 0.20 and positive expected offer utility; and (iii) uncertainty review, which routes eligible customers with normalised entropy ≥ 0.65 to human review and otherwise offers [4,5,12]. The cost-aware baseline is the primary economic comparator.</w:t>
       </w:r>
     </w:p>
     <w:p>
@@ -394,7 +411,7 @@
           <w:color w:val="000000"/>
           <w:sz w:val="24"/>
         </w:rPr>
-        <w:t>The proposed KGDI policy uses a nominal operating point of 85% of B on cost-aware offers and 15% reserved for human review. That 15% represents a deliberately limited minority review capacity, not a unique optimum. A robustness path over economic shares {0.70, 0.75, 0.80, 0.85, 0.90, 1.00} is shown in Fig. 2. Review eligibility requires pᵢ ≥ 0.20, CLTV at or above the 75th percentile, positive review utility, and either moderate-or-higher entropy or kᵢ − pᵢ &gt; 0. Leftover budget returns to cost-aware offers. Observed churn is not used to choose actions.</w:t>
+        <w:t>The proposed KGDI policy uses a nominal operating point of 85% of B on cost-aware offers and 15% reserved for human review. The minority review reserve is an interpretable capacity assumption, not a uniquely optimal split. Review eligibility requires pᵢ ≥ 0.20, CLTV at or above the 75th percentile, positive review utility, and either normalised entropy ≥ 0.45 or kᵢ − pᵢ &gt; 0. Eligible review candidates are ranked by expected review utility divided by expected review cost. Any leftover budget returns to cost-aware offers. A robustness path over economic shares {0.70, 0.75, 0.80, 0.85, 0.90, 1.00} is evaluated. Observed churn is never used to choose actions.</w:t>
       </w:r>
     </w:p>
     <w:p>
@@ -411,13 +428,13 @@
           <w:color w:val="000000"/>
           <w:sz w:val="24"/>
         </w:rPr>
-        <w:t>Default values are cₒ = $100, s = 0.35, cₕ = $25, Se = Sp = 0.85. Inference versus cost-aware targeting uses 1000 paired customer bootstrap resamples with policy rerouting and budget reallocation inside every resample. The bootstrap conditions on the previously generated out-of-fold risk estimates and therefore quantifies decision-allocation uncertainty rather than full model-training uncertainty. Reported quantities are the observed delta, a percentile 95% interval, and the fraction of resamples with a positive delta. That fraction is not a classical p-value.</w:t>
+        <w:t>Default values are cₒ = $100, s = 0.35, cₕ = $25, Se = Sp = 0.85. Inference versus cost-aware targeting uses 1000 paired customer bootstrap resamples with policy rerouting and budget reallocation inside every resample. The bootstrap conditions on previously generated out-of-fold risk estimates and therefore quantifies decision-allocation uncertainty rather than full model-training uncertainty. Reported quantities are observed deltas, percentile 95% intervals, and the fraction of resamples with a positive delta; those fractions are not classical p-values.</w:t>
       </w:r>
     </w:p>
     <w:p>
       <w:pPr>
         <w:pStyle w:val="Heading1"/>
-        <w:spacing w:lineRule="auto" w:line="480" w:after="0" w:before="240"/>
+        <w:spacing w:lineRule="auto" w:line="480" w:after="0" w:before="120"/>
       </w:pPr>
       <w:r>
         <w:rPr>
@@ -444,13 +461,30 @@
           <w:color w:val="000000"/>
           <w:sz w:val="24"/>
         </w:rPr>
-        <w:t>The IBM Telco Customer Churn workbook contains 7043 customers and a 26.5% churn rate. High-value churners, used only for evaluation, are observed churners with CLTV percentile at least 0.75 (n = 365). Because the proposed policy also uses the 0.75 CLTV quantile as a review gate, high-value reach is an intended strategic coverage objective, not an independent surprise metric. All policies share planning budget $140,860. Public telecommunications tables of this type remain a standard test-bed [1,2,7]. Primary decision endpoint: high-value churn reach under the common expected-cost budget. Secondary decision endpoints: overall churn reach and the outcome-anchored net-benefit proxy. Component ablations and scenario perturbations are reported in the Results as supplementary analyses, not as additional primary tables. Intervention rate may exceed 20% when cheaper reviews replace offers while expected selected cost remains at B.</w:t>
+        <w:t>The IBM Telco Customer Churn workbook contains 7043 customers and a 26.5% churn rate. High-value churners, used only for evaluation, are observed churners with CLTV percentile at least 0.75 (n = 365). Because the policy uses the same 0.75 CLTV quantile as a review gate, high-value reach is an intended coverage objective. All primary policies share planning budget $140,860. Action rate may exceed 20% when cheaper reviews replace offers while expected selected cost remains at B. Public telecommunications tables of this type remain a standard test-bed [1,2,7].</w:t>
+      </w:r>
+    </w:p>
+    <w:p>
+      <w:pPr>
+        <w:spacing w:after="0" w:before="0" w:lineRule="auto" w:line="480"/>
+        <w:ind w:firstLine="360"/>
+        <w:jc w:val="both"/>
+      </w:pPr>
+      <w:r>
+        <w:rPr>
+          <w:rFonts w:ascii="Times New Roman" w:hAnsi="Times New Roman" w:eastAsia="Times New Roman"/>
+          <w:b w:val="0"/>
+          <w:i w:val="0"/>
+          <w:color w:val="000000"/>
+          <w:sz w:val="24"/>
+        </w:rPr>
+        <w:t>Two post hoc analyses probe mechanism and efficiency without refitting the models. A matched CLTV-reserved offer-only comparator uses the same 85/15 budget structure, but spends the reserve on eligible high-CLTV direct offers rather than review. An exact binary epsilon-constraint programme on frozen out-of-fold scores traces the frontier between expected economic utility and expected high-value churn-risk mass, subject to the same budget and one action per customer. Observed churn labels are excluded from that optimisation.</w:t>
       </w:r>
     </w:p>
     <w:p>
       <w:pPr>
         <w:pStyle w:val="Heading1"/>
-        <w:spacing w:lineRule="auto" w:line="480" w:after="0" w:before="240"/>
+        <w:spacing w:lineRule="auto" w:line="480" w:after="0" w:before="120"/>
       </w:pPr>
       <w:r>
         <w:rPr>
@@ -477,12 +511,12 @@
           <w:color w:val="000000"/>
           <w:sz w:val="24"/>
         </w:rPr>
-        <w:t>Table 1 shows that the ensemble is well calibrated (Brier 0.130 ± 0.001; expected calibration error 0.012 ± 0.003). Table 1 licences the probabilities in Eqs. (1)-(2). No predictive state of the art is claimed [1,2,7,9]. Logistic regression has a higher F1 than the ensemble; the policy uses ranking and calibration rather than F1.</w:t>
+        <w:t>Table 1 shows that the ensemble is well calibrated (Brier 0.130 ± 0.001; expected calibration error 0.012 ± 0.003) and therefore supports using these probabilities in Eqs. (1)-(2). No predictive state of the art is claimed [1,2,7,9]. Logistic regression has a higher F1 than the ensemble; the policy uses ranking and calibration rather than F1.</w:t>
       </w:r>
     </w:p>
     <w:p>
       <w:pPr>
-        <w:spacing w:after="240" w:before="120" w:lineRule="auto" w:line="276"/>
+        <w:spacing w:after="80" w:before="40" w:lineRule="auto" w:line="240"/>
         <w:ind w:firstLine="0"/>
         <w:jc w:val="left"/>
       </w:pPr>
@@ -492,7 +526,7 @@
           <w:b w:val="0"/>
           <w:i/>
           <w:color w:val="000000"/>
-          <w:sz w:val="22"/>
+          <w:sz w:val="20"/>
         </w:rPr>
         <w:t>Table 1. Repeated out-of-fold predictive performance (mean ± sd over five repeats).</w:t>
       </w:r>
@@ -1570,12 +1604,12 @@
           <w:color w:val="000000"/>
           <w:sz w:val="24"/>
         </w:rPr>
-        <w:t>Table 2 is the decision result. Cost-aware targeting is the strongest economic baseline among the offer-only policies ($65,209). Uncertainty review raises high-value reach to 54.2% with 1650 reviews, but the proxy falls to $59,253. Proposed KGDI issues 1297 offers and 166 reviews (intervention rate 20.8% because reviews are cheaper than offers; expected cost remains at B). High-value churn reach is 56.4% versus 43.8% for cost-aware targeting (+12.6 percentage points; 1000/1000 resamples positive; 95% interval [9.3, 16.5] pp). Overall churn reach is essentially unchanged (50.6% versus 49.9%). The net-benefit proxy is $67,529 (+$2320). In 968/1000 resamples the economic delta was positive, but the 95% interval [-$92, $5397] includes a small negative value, so economic dominance is not confirmed.</w:t>
+        <w:t>Table 2 summarises the decision results. Cost-aware targeting is the strongest offer-only economic baseline ($65,209). Uncertainty review raises high-value reach to 54.2% with 1650 reviews, but the proxy falls to $59,253. Proposed KGDI issues 1297 offers and 166 reviews (20.8% action rate; expected selected cost remains within B). High-value churn reach is 56.4% versus 43.8% for cost-aware targeting (+12.6 percentage points; 1000/1000 primary bootstrap resamples positive; 95% interval [9.3, 16.5] pp). Overall churn reach is essentially unchanged (50.6% versus 49.9%). The net-benefit proxy is $67,529 (+$2320), but its 95% interval [-$92, $5397] includes a small negative value, so economic dominance is not confirmed. The matched CLTV-reserved offer-only comparator reaches only 44.1% high-value churn at $65,157. In a paired mechanism bootstrap between the CLTV-only review-reserve policy-which is action-identical to full KGDI at the nominal point-and the matched offer-only reserve, high-value reach improves by 12.3 percentage points (1000/1000; 95% interval [8.8, 15.6] pp); the net-benefit difference is +$2372 (967/1000; 95% interval [-$149, $4875]). Under the assumed reviewer model, review routing, not CLTV reservation alone, produces the coverage gain.</w:t>
       </w:r>
     </w:p>
     <w:p>
       <w:pPr>
-        <w:spacing w:after="240" w:before="120" w:lineRule="auto" w:line="276"/>
+        <w:spacing w:after="80" w:before="40" w:lineRule="auto" w:line="240"/>
         <w:ind w:firstLine="0"/>
         <w:jc w:val="left"/>
       </w:pPr>
@@ -1585,9 +1619,9 @@
           <w:b w:val="0"/>
           <w:i/>
           <w:color w:val="000000"/>
-          <w:sz w:val="22"/>
+          <w:sz w:val="20"/>
         </w:rPr>
-        <w:t>Table 2. Budget-matched decision performance. Deltas are versus cost-aware targeting (1000 paired policy-rerun bootstrap resamples).</w:t>
+        <w:t>Table 2. Budget-matched decision performance. Primary deltas for KGDI are versus cost-aware targeting; the CLTV-reserved offer-only row is a post hoc matched mechanism comparator.</w:t>
       </w:r>
     </w:p>
     <w:tbl>
@@ -1598,22 +1632,18 @@
         <w:tblLook w:firstColumn="1" w:firstRow="1" w:lastColumn="0" w:lastRow="0" w:noHBand="0" w:noVBand="1" w:val="04A0"/>
       </w:tblPr>
       <w:tblGrid>
-        <w:gridCol w:w="916"/>
-        <w:gridCol w:w="916"/>
-        <w:gridCol w:w="916"/>
-        <w:gridCol w:w="916"/>
-        <w:gridCol w:w="916"/>
-        <w:gridCol w:w="916"/>
-        <w:gridCol w:w="916"/>
-        <w:gridCol w:w="916"/>
-        <w:gridCol w:w="916"/>
-        <w:gridCol w:w="916"/>
-        <w:gridCol w:w="916"/>
+        <w:gridCol w:w="1440"/>
+        <w:gridCol w:w="1440"/>
+        <w:gridCol w:w="1440"/>
+        <w:gridCol w:w="1440"/>
+        <w:gridCol w:w="1440"/>
+        <w:gridCol w:w="1440"/>
+        <w:gridCol w:w="1440"/>
       </w:tblGrid>
       <w:tr>
         <w:tc>
           <w:tcPr>
-            <w:tcW w:type="dxa" w:w="1656"/>
+            <w:tcW w:type="dxa" w:w="2664"/>
             <w:shd w:fill="D9E2F3" w:val="clear"/>
             <w:tcBorders>
               <w:top w:val="single" w:sz="4" w:color="666666"/>
@@ -1642,7 +1672,7 @@
         </w:tc>
         <w:tc>
           <w:tcPr>
-            <w:tcW w:type="dxa" w:w="792"/>
+            <w:tcW w:type="dxa" w:w="1080"/>
             <w:shd w:fill="D9E2F3" w:val="clear"/>
             <w:tcBorders>
               <w:top w:val="single" w:sz="4" w:color="666666"/>
@@ -1665,13 +1695,13 @@
                 <w:color w:val="000000"/>
                 <w:sz w:val="16"/>
               </w:rPr>
-              <w:t>Interv. %</w:t>
+              <w:t>Action %</w:t>
             </w:r>
           </w:p>
         </w:tc>
         <w:tc>
           <w:tcPr>
-            <w:tcW w:type="dxa" w:w="893"/>
+            <w:tcW w:type="dxa" w:w="1512"/>
             <w:shd w:fill="D9E2F3" w:val="clear"/>
             <w:tcBorders>
               <w:top w:val="single" w:sz="4" w:color="666666"/>
@@ -1700,7 +1730,7 @@
         </w:tc>
         <w:tc>
           <w:tcPr>
-            <w:tcW w:type="dxa" w:w="835"/>
+            <w:tcW w:type="dxa" w:w="1224"/>
             <w:shd w:fill="D9E2F3" w:val="clear"/>
             <w:tcBorders>
               <w:top w:val="single" w:sz="4" w:color="666666"/>
@@ -1729,7 +1759,7 @@
         </w:tc>
         <w:tc>
           <w:tcPr>
-            <w:tcW w:type="dxa" w:w="1224"/>
+            <w:tcW w:type="dxa" w:w="1656"/>
             <w:shd w:fill="D9E2F3" w:val="clear"/>
             <w:tcBorders>
               <w:top w:val="single" w:sz="4" w:color="666666"/>
@@ -1758,7 +1788,7 @@
         </w:tc>
         <w:tc>
           <w:tcPr>
-            <w:tcW w:type="dxa" w:w="1224"/>
+            <w:tcW w:type="dxa" w:w="1656"/>
             <w:shd w:fill="D9E2F3" w:val="clear"/>
             <w:tcBorders>
               <w:top w:val="single" w:sz="4" w:color="666666"/>
@@ -1781,13 +1811,13 @@
                 <w:color w:val="000000"/>
                 <w:sz w:val="16"/>
               </w:rPr>
-              <w:t>Net-benefit (USD)</w:t>
+              <w:t>Net-benefit ($)</w:t>
             </w:r>
           </w:p>
         </w:tc>
         <w:tc>
           <w:tcPr>
-            <w:tcW w:type="dxa" w:w="691"/>
+            <w:tcW w:type="dxa" w:w="1656"/>
             <w:shd w:fill="D9E2F3" w:val="clear"/>
             <w:tcBorders>
               <w:top w:val="single" w:sz="4" w:color="666666"/>
@@ -1810,123 +1840,7 @@
                 <w:color w:val="000000"/>
                 <w:sz w:val="16"/>
               </w:rPr>
-              <w:t>Δ USD</w:t>
-            </w:r>
-          </w:p>
-        </w:tc>
-        <w:tc>
-          <w:tcPr>
-            <w:tcW w:type="dxa" w:w="1123"/>
-            <w:shd w:fill="D9E2F3" w:val="clear"/>
-            <w:tcBorders>
-              <w:top w:val="single" w:sz="4" w:color="666666"/>
-              <w:left w:val="single" w:sz="4" w:color="666666"/>
-              <w:bottom w:val="single" w:sz="4" w:color="666666"/>
-              <w:right w:val="single" w:sz="4" w:color="666666"/>
-            </w:tcBorders>
-          </w:tcPr>
-          <w:p>
-            <w:pPr>
-              <w:spacing w:line="240" w:lineRule="auto" w:after="0" w:before="0"/>
-              <w:jc w:val="center"/>
-            </w:pPr>
-            <w:r/>
-            <w:r>
-              <w:rPr>
-                <w:rFonts w:ascii="Times New Roman" w:hAnsi="Times New Roman" w:eastAsia="Times New Roman"/>
-                <w:b/>
-                <w:i w:val="0"/>
-                <w:color w:val="000000"/>
-                <w:sz w:val="16"/>
-              </w:rPr>
-              <w:t>95% CI</w:t>
-            </w:r>
-          </w:p>
-        </w:tc>
-        <w:tc>
-          <w:tcPr>
-            <w:tcW w:type="dxa" w:w="792"/>
-            <w:shd w:fill="D9E2F3" w:val="clear"/>
-            <w:tcBorders>
-              <w:top w:val="single" w:sz="4" w:color="666666"/>
-              <w:left w:val="single" w:sz="4" w:color="666666"/>
-              <w:bottom w:val="single" w:sz="4" w:color="666666"/>
-              <w:right w:val="single" w:sz="4" w:color="666666"/>
-            </w:tcBorders>
-          </w:tcPr>
-          <w:p>
-            <w:pPr>
-              <w:spacing w:line="240" w:lineRule="auto" w:after="0" w:before="0"/>
-              <w:jc w:val="center"/>
-            </w:pPr>
-            <w:r/>
-            <w:r>
-              <w:rPr>
-                <w:rFonts w:ascii="Times New Roman" w:hAnsi="Times New Roman" w:eastAsia="Times New Roman"/>
-                <w:b/>
-                <w:i w:val="0"/>
-                <w:color w:val="000000"/>
-                <w:sz w:val="16"/>
-              </w:rPr>
-              <w:t>P(Δ&gt;0) $</w:t>
-            </w:r>
-          </w:p>
-        </w:tc>
-        <w:tc>
-          <w:tcPr>
-            <w:tcW w:type="dxa" w:w="835"/>
-            <w:shd w:fill="D9E2F3" w:val="clear"/>
-            <w:tcBorders>
-              <w:top w:val="single" w:sz="4" w:color="666666"/>
-              <w:left w:val="single" w:sz="4" w:color="666666"/>
-              <w:bottom w:val="single" w:sz="4" w:color="666666"/>
-              <w:right w:val="single" w:sz="4" w:color="666666"/>
-            </w:tcBorders>
-          </w:tcPr>
-          <w:p>
-            <w:pPr>
-              <w:spacing w:line="240" w:lineRule="auto" w:after="0" w:before="0"/>
-              <w:jc w:val="center"/>
-            </w:pPr>
-            <w:r/>
-            <w:r>
-              <w:rPr>
-                <w:rFonts w:ascii="Times New Roman" w:hAnsi="Times New Roman" w:eastAsia="Times New Roman"/>
-                <w:b/>
-                <w:i w:val="0"/>
-                <w:color w:val="000000"/>
-                <w:sz w:val="16"/>
-              </w:rPr>
-              <w:t>Δ HV (pp)</w:t>
-            </w:r>
-          </w:p>
-        </w:tc>
-        <w:tc>
-          <w:tcPr>
-            <w:tcW w:type="dxa" w:w="835"/>
-            <w:shd w:fill="D9E2F3" w:val="clear"/>
-            <w:tcBorders>
-              <w:top w:val="single" w:sz="4" w:color="666666"/>
-              <w:left w:val="single" w:sz="4" w:color="666666"/>
-              <w:bottom w:val="single" w:sz="4" w:color="666666"/>
-              <w:right w:val="single" w:sz="4" w:color="666666"/>
-            </w:tcBorders>
-          </w:tcPr>
-          <w:p>
-            <w:pPr>
-              <w:spacing w:line="240" w:lineRule="auto" w:after="0" w:before="0"/>
-              <w:jc w:val="center"/>
-            </w:pPr>
-            <w:r/>
-            <w:r>
-              <w:rPr>
-                <w:rFonts w:ascii="Times New Roman" w:hAnsi="Times New Roman" w:eastAsia="Times New Roman"/>
-                <w:b/>
-                <w:i w:val="0"/>
-                <w:color w:val="000000"/>
-                <w:sz w:val="16"/>
-              </w:rPr>
-              <w:t>P(Δ&gt;0) HV</w:t>
+              <w:t>Expected cost ($)</w:t>
             </w:r>
           </w:p>
         </w:tc>
@@ -1934,7 +1848,7 @@
       <w:tr>
         <w:tc>
           <w:tcPr>
-            <w:tcW w:type="dxa" w:w="1656"/>
+            <w:tcW w:type="dxa" w:w="2664"/>
             <w:tcBorders>
               <w:top w:val="single" w:sz="4" w:color="666666"/>
               <w:left w:val="single" w:sz="4" w:color="666666"/>
@@ -1962,7 +1876,7 @@
         </w:tc>
         <w:tc>
           <w:tcPr>
-            <w:tcW w:type="dxa" w:w="792"/>
+            <w:tcW w:type="dxa" w:w="1080"/>
             <w:tcBorders>
               <w:top w:val="single" w:sz="4" w:color="666666"/>
               <w:left w:val="single" w:sz="4" w:color="666666"/>
@@ -1990,7 +1904,7 @@
         </w:tc>
         <w:tc>
           <w:tcPr>
-            <w:tcW w:type="dxa" w:w="893"/>
+            <w:tcW w:type="dxa" w:w="1512"/>
             <w:tcBorders>
               <w:top w:val="single" w:sz="4" w:color="666666"/>
               <w:left w:val="single" w:sz="4" w:color="666666"/>
@@ -2018,7 +1932,7 @@
         </w:tc>
         <w:tc>
           <w:tcPr>
-            <w:tcW w:type="dxa" w:w="835"/>
+            <w:tcW w:type="dxa" w:w="1224"/>
             <w:tcBorders>
               <w:top w:val="single" w:sz="4" w:color="666666"/>
               <w:left w:val="single" w:sz="4" w:color="666666"/>
@@ -2046,7 +1960,7 @@
         </w:tc>
         <w:tc>
           <w:tcPr>
-            <w:tcW w:type="dxa" w:w="1224"/>
+            <w:tcW w:type="dxa" w:w="1656"/>
             <w:tcBorders>
               <w:top w:val="single" w:sz="4" w:color="666666"/>
               <w:left w:val="single" w:sz="4" w:color="666666"/>
@@ -2074,7 +1988,7 @@
         </w:tc>
         <w:tc>
           <w:tcPr>
-            <w:tcW w:type="dxa" w:w="1224"/>
+            <w:tcW w:type="dxa" w:w="1656"/>
             <w:tcBorders>
               <w:top w:val="single" w:sz="4" w:color="666666"/>
               <w:left w:val="single" w:sz="4" w:color="666666"/>
@@ -2102,7 +2016,7 @@
         </w:tc>
         <w:tc>
           <w:tcPr>
-            <w:tcW w:type="dxa" w:w="691"/>
+            <w:tcW w:type="dxa" w:w="1656"/>
             <w:tcBorders>
               <w:top w:val="single" w:sz="4" w:color="666666"/>
               <w:left w:val="single" w:sz="4" w:color="666666"/>
@@ -2124,119 +2038,7 @@
                 <w:color w:val="000000"/>
                 <w:sz w:val="16"/>
               </w:rPr>
-              <w:t>—</w:t>
-            </w:r>
-          </w:p>
-        </w:tc>
-        <w:tc>
-          <w:tcPr>
-            <w:tcW w:type="dxa" w:w="1123"/>
-            <w:tcBorders>
-              <w:top w:val="single" w:sz="4" w:color="666666"/>
-              <w:left w:val="single" w:sz="4" w:color="666666"/>
-              <w:bottom w:val="single" w:sz="4" w:color="666666"/>
-              <w:right w:val="single" w:sz="4" w:color="666666"/>
-            </w:tcBorders>
-          </w:tcPr>
-          <w:p>
-            <w:pPr>
-              <w:spacing w:line="240" w:lineRule="auto" w:after="0" w:before="0"/>
-              <w:jc w:val="center"/>
-            </w:pPr>
-            <w:r/>
-            <w:r>
-              <w:rPr>
-                <w:rFonts w:ascii="Times New Roman" w:hAnsi="Times New Roman" w:eastAsia="Times New Roman"/>
-                <w:b w:val="0"/>
-                <w:i w:val="0"/>
-                <w:color w:val="000000"/>
-                <w:sz w:val="16"/>
-              </w:rPr>
-              <w:t>—</w:t>
-            </w:r>
-          </w:p>
-        </w:tc>
-        <w:tc>
-          <w:tcPr>
-            <w:tcW w:type="dxa" w:w="792"/>
-            <w:tcBorders>
-              <w:top w:val="single" w:sz="4" w:color="666666"/>
-              <w:left w:val="single" w:sz="4" w:color="666666"/>
-              <w:bottom w:val="single" w:sz="4" w:color="666666"/>
-              <w:right w:val="single" w:sz="4" w:color="666666"/>
-            </w:tcBorders>
-          </w:tcPr>
-          <w:p>
-            <w:pPr>
-              <w:spacing w:line="240" w:lineRule="auto" w:after="0" w:before="0"/>
-              <w:jc w:val="center"/>
-            </w:pPr>
-            <w:r/>
-            <w:r>
-              <w:rPr>
-                <w:rFonts w:ascii="Times New Roman" w:hAnsi="Times New Roman" w:eastAsia="Times New Roman"/>
-                <w:b w:val="0"/>
-                <w:i w:val="0"/>
-                <w:color w:val="000000"/>
-                <w:sz w:val="16"/>
-              </w:rPr>
-              <w:t>—</w:t>
-            </w:r>
-          </w:p>
-        </w:tc>
-        <w:tc>
-          <w:tcPr>
-            <w:tcW w:type="dxa" w:w="835"/>
-            <w:tcBorders>
-              <w:top w:val="single" w:sz="4" w:color="666666"/>
-              <w:left w:val="single" w:sz="4" w:color="666666"/>
-              <w:bottom w:val="single" w:sz="4" w:color="666666"/>
-              <w:right w:val="single" w:sz="4" w:color="666666"/>
-            </w:tcBorders>
-          </w:tcPr>
-          <w:p>
-            <w:pPr>
-              <w:spacing w:line="240" w:lineRule="auto" w:after="0" w:before="0"/>
-              <w:jc w:val="center"/>
-            </w:pPr>
-            <w:r/>
-            <w:r>
-              <w:rPr>
-                <w:rFonts w:ascii="Times New Roman" w:hAnsi="Times New Roman" w:eastAsia="Times New Roman"/>
-                <w:b w:val="0"/>
-                <w:i w:val="0"/>
-                <w:color w:val="000000"/>
-                <w:sz w:val="16"/>
-              </w:rPr>
-              <w:t>—</w:t>
-            </w:r>
-          </w:p>
-        </w:tc>
-        <w:tc>
-          <w:tcPr>
-            <w:tcW w:type="dxa" w:w="835"/>
-            <w:tcBorders>
-              <w:top w:val="single" w:sz="4" w:color="666666"/>
-              <w:left w:val="single" w:sz="4" w:color="666666"/>
-              <w:bottom w:val="single" w:sz="4" w:color="666666"/>
-              <w:right w:val="single" w:sz="4" w:color="666666"/>
-            </w:tcBorders>
-          </w:tcPr>
-          <w:p>
-            <w:pPr>
-              <w:spacing w:line="240" w:lineRule="auto" w:after="0" w:before="0"/>
-              <w:jc w:val="center"/>
-            </w:pPr>
-            <w:r/>
-            <w:r>
-              <w:rPr>
-                <w:rFonts w:ascii="Times New Roman" w:hAnsi="Times New Roman" w:eastAsia="Times New Roman"/>
-                <w:b w:val="0"/>
-                <w:i w:val="0"/>
-                <w:color w:val="000000"/>
-                <w:sz w:val="16"/>
-              </w:rPr>
-              <w:t>—</w:t>
+              <w:t>140,800</w:t>
             </w:r>
           </w:p>
         </w:tc>
@@ -2244,7 +2046,7 @@
       <w:tr>
         <w:tc>
           <w:tcPr>
-            <w:tcW w:type="dxa" w:w="1656"/>
+            <w:tcW w:type="dxa" w:w="2664"/>
             <w:tcBorders>
               <w:top w:val="single" w:sz="4" w:color="666666"/>
               <w:left w:val="single" w:sz="4" w:color="666666"/>
@@ -2272,7 +2074,7 @@
         </w:tc>
         <w:tc>
           <w:tcPr>
-            <w:tcW w:type="dxa" w:w="792"/>
+            <w:tcW w:type="dxa" w:w="1080"/>
             <w:tcBorders>
               <w:top w:val="single" w:sz="4" w:color="666666"/>
               <w:left w:val="single" w:sz="4" w:color="666666"/>
@@ -2300,7 +2102,7 @@
         </w:tc>
         <w:tc>
           <w:tcPr>
-            <w:tcW w:type="dxa" w:w="893"/>
+            <w:tcW w:type="dxa" w:w="1512"/>
             <w:tcBorders>
               <w:top w:val="single" w:sz="4" w:color="666666"/>
               <w:left w:val="single" w:sz="4" w:color="666666"/>
@@ -2328,7 +2130,7 @@
         </w:tc>
         <w:tc>
           <w:tcPr>
-            <w:tcW w:type="dxa" w:w="835"/>
+            <w:tcW w:type="dxa" w:w="1224"/>
             <w:tcBorders>
               <w:top w:val="single" w:sz="4" w:color="666666"/>
               <w:left w:val="single" w:sz="4" w:color="666666"/>
@@ -2356,7 +2158,7 @@
         </w:tc>
         <w:tc>
           <w:tcPr>
-            <w:tcW w:type="dxa" w:w="1224"/>
+            <w:tcW w:type="dxa" w:w="1656"/>
             <w:tcBorders>
               <w:top w:val="single" w:sz="4" w:color="666666"/>
               <w:left w:val="single" w:sz="4" w:color="666666"/>
@@ -2384,7 +2186,7 @@
         </w:tc>
         <w:tc>
           <w:tcPr>
-            <w:tcW w:type="dxa" w:w="1224"/>
+            <w:tcW w:type="dxa" w:w="1656"/>
             <w:tcBorders>
               <w:top w:val="single" w:sz="4" w:color="666666"/>
               <w:left w:val="single" w:sz="4" w:color="666666"/>
@@ -2412,7 +2214,7 @@
         </w:tc>
         <w:tc>
           <w:tcPr>
-            <w:tcW w:type="dxa" w:w="691"/>
+            <w:tcW w:type="dxa" w:w="1656"/>
             <w:tcBorders>
               <w:top w:val="single" w:sz="4" w:color="666666"/>
               <w:left w:val="single" w:sz="4" w:color="666666"/>
@@ -2434,13 +2236,43 @@
                 <w:color w:val="000000"/>
                 <w:sz w:val="16"/>
               </w:rPr>
-              <w:t>—</w:t>
+              <w:t>140,800</w:t>
+            </w:r>
+          </w:p>
+        </w:tc>
+      </w:tr>
+      <w:tr>
+        <w:tc>
+          <w:tcPr>
+            <w:tcW w:type="dxa" w:w="2664"/>
+            <w:tcBorders>
+              <w:top w:val="single" w:sz="4" w:color="666666"/>
+              <w:left w:val="single" w:sz="4" w:color="666666"/>
+              <w:bottom w:val="single" w:sz="4" w:color="666666"/>
+              <w:right w:val="single" w:sz="4" w:color="666666"/>
+            </w:tcBorders>
+          </w:tcPr>
+          <w:p>
+            <w:pPr>
+              <w:spacing w:line="240" w:lineRule="auto" w:after="0" w:before="0"/>
+              <w:jc w:val="left"/>
+            </w:pPr>
+            <w:r/>
+            <w:r>
+              <w:rPr>
+                <w:rFonts w:ascii="Times New Roman" w:hAnsi="Times New Roman" w:eastAsia="Times New Roman"/>
+                <w:b w:val="0"/>
+                <w:i w:val="0"/>
+                <w:color w:val="000000"/>
+                <w:sz w:val="16"/>
+              </w:rPr>
+              <w:t>CLTV-reserved offer-only</w:t>
             </w:r>
           </w:p>
         </w:tc>
         <w:tc>
           <w:tcPr>
-            <w:tcW w:type="dxa" w:w="1123"/>
+            <w:tcW w:type="dxa" w:w="1080"/>
             <w:tcBorders>
               <w:top w:val="single" w:sz="4" w:color="666666"/>
               <w:left w:val="single" w:sz="4" w:color="666666"/>
@@ -2462,13 +2294,13 @@
                 <w:color w:val="000000"/>
                 <w:sz w:val="16"/>
               </w:rPr>
-              <w:t>—</w:t>
+              <w:t>20.0</w:t>
             </w:r>
           </w:p>
         </w:tc>
         <w:tc>
           <w:tcPr>
-            <w:tcW w:type="dxa" w:w="792"/>
+            <w:tcW w:type="dxa" w:w="1512"/>
             <w:tcBorders>
               <w:top w:val="single" w:sz="4" w:color="666666"/>
               <w:left w:val="single" w:sz="4" w:color="666666"/>
@@ -2490,13 +2322,13 @@
                 <w:color w:val="000000"/>
                 <w:sz w:val="16"/>
               </w:rPr>
-              <w:t>—</w:t>
+              <w:t>49.9</w:t>
             </w:r>
           </w:p>
         </w:tc>
         <w:tc>
           <w:tcPr>
-            <w:tcW w:type="dxa" w:w="835"/>
+            <w:tcW w:type="dxa" w:w="1224"/>
             <w:tcBorders>
               <w:top w:val="single" w:sz="4" w:color="666666"/>
               <w:left w:val="single" w:sz="4" w:color="666666"/>
@@ -2518,13 +2350,13 @@
                 <w:color w:val="000000"/>
                 <w:sz w:val="16"/>
               </w:rPr>
-              <w:t>—</w:t>
+              <w:t>44.1</w:t>
             </w:r>
           </w:p>
         </w:tc>
         <w:tc>
           <w:tcPr>
-            <w:tcW w:type="dxa" w:w="835"/>
+            <w:tcW w:type="dxa" w:w="1656"/>
             <w:tcBorders>
               <w:top w:val="single" w:sz="4" w:color="666666"/>
               <w:left w:val="single" w:sz="4" w:color="666666"/>
@@ -2546,7 +2378,63 @@
                 <w:color w:val="000000"/>
                 <w:sz w:val="16"/>
               </w:rPr>
-              <w:t>—</w:t>
+              <w:t>1408 / 0</w:t>
+            </w:r>
+          </w:p>
+        </w:tc>
+        <w:tc>
+          <w:tcPr>
+            <w:tcW w:type="dxa" w:w="1656"/>
+            <w:tcBorders>
+              <w:top w:val="single" w:sz="4" w:color="666666"/>
+              <w:left w:val="single" w:sz="4" w:color="666666"/>
+              <w:bottom w:val="single" w:sz="4" w:color="666666"/>
+              <w:right w:val="single" w:sz="4" w:color="666666"/>
+            </w:tcBorders>
+          </w:tcPr>
+          <w:p>
+            <w:pPr>
+              <w:spacing w:line="240" w:lineRule="auto" w:after="0" w:before="0"/>
+              <w:jc w:val="center"/>
+            </w:pPr>
+            <w:r/>
+            <w:r>
+              <w:rPr>
+                <w:rFonts w:ascii="Times New Roman" w:hAnsi="Times New Roman" w:eastAsia="Times New Roman"/>
+                <w:b w:val="0"/>
+                <w:i w:val="0"/>
+                <w:color w:val="000000"/>
+                <w:sz w:val="16"/>
+              </w:rPr>
+              <w:t>65,157</w:t>
+            </w:r>
+          </w:p>
+        </w:tc>
+        <w:tc>
+          <w:tcPr>
+            <w:tcW w:type="dxa" w:w="1656"/>
+            <w:tcBorders>
+              <w:top w:val="single" w:sz="4" w:color="666666"/>
+              <w:left w:val="single" w:sz="4" w:color="666666"/>
+              <w:bottom w:val="single" w:sz="4" w:color="666666"/>
+              <w:right w:val="single" w:sz="4" w:color="666666"/>
+            </w:tcBorders>
+          </w:tcPr>
+          <w:p>
+            <w:pPr>
+              <w:spacing w:line="240" w:lineRule="auto" w:after="0" w:before="0"/>
+              <w:jc w:val="center"/>
+            </w:pPr>
+            <w:r/>
+            <w:r>
+              <w:rPr>
+                <w:rFonts w:ascii="Times New Roman" w:hAnsi="Times New Roman" w:eastAsia="Times New Roman"/>
+                <w:b w:val="0"/>
+                <w:i w:val="0"/>
+                <w:color w:val="000000"/>
+                <w:sz w:val="16"/>
+              </w:rPr>
+              <w:t>140,800</w:t>
             </w:r>
           </w:p>
         </w:tc>
@@ -2554,7 +2442,7 @@
       <w:tr>
         <w:tc>
           <w:tcPr>
-            <w:tcW w:type="dxa" w:w="1656"/>
+            <w:tcW w:type="dxa" w:w="2664"/>
             <w:tcBorders>
               <w:top w:val="single" w:sz="4" w:color="666666"/>
               <w:left w:val="single" w:sz="4" w:color="666666"/>
@@ -2582,7 +2470,7 @@
         </w:tc>
         <w:tc>
           <w:tcPr>
-            <w:tcW w:type="dxa" w:w="792"/>
+            <w:tcW w:type="dxa" w:w="1080"/>
             <w:tcBorders>
               <w:top w:val="single" w:sz="4" w:color="666666"/>
               <w:left w:val="single" w:sz="4" w:color="666666"/>
@@ -2610,345 +2498,7 @@
         </w:tc>
         <w:tc>
           <w:tcPr>
-            <w:tcW w:type="dxa" w:w="893"/>
-            <w:tcBorders>
-              <w:top w:val="single" w:sz="4" w:color="666666"/>
-              <w:left w:val="single" w:sz="4" w:color="666666"/>
-              <w:bottom w:val="single" w:sz="4" w:color="666666"/>
-              <w:right w:val="single" w:sz="4" w:color="666666"/>
-            </w:tcBorders>
-          </w:tcPr>
-          <w:p>
-            <w:pPr>
-              <w:spacing w:line="240" w:lineRule="auto" w:after="0" w:before="0"/>
-              <w:jc w:val="center"/>
-            </w:pPr>
-            <w:r/>
-            <w:r>
-              <w:rPr>
-                <w:rFonts w:ascii="Times New Roman" w:hAnsi="Times New Roman" w:eastAsia="Times New Roman"/>
-                <w:b w:val="0"/>
-                <w:i w:val="0"/>
-                <w:color w:val="000000"/>
-                <w:sz w:val="16"/>
-              </w:rPr>
-              <w:t>56.4</w:t>
-            </w:r>
-          </w:p>
-        </w:tc>
-        <w:tc>
-          <w:tcPr>
-            <w:tcW w:type="dxa" w:w="835"/>
-            <w:tcBorders>
-              <w:top w:val="single" w:sz="4" w:color="666666"/>
-              <w:left w:val="single" w:sz="4" w:color="666666"/>
-              <w:bottom w:val="single" w:sz="4" w:color="666666"/>
-              <w:right w:val="single" w:sz="4" w:color="666666"/>
-            </w:tcBorders>
-          </w:tcPr>
-          <w:p>
-            <w:pPr>
-              <w:spacing w:line="240" w:lineRule="auto" w:after="0" w:before="0"/>
-              <w:jc w:val="center"/>
-            </w:pPr>
-            <w:r/>
-            <w:r>
-              <w:rPr>
-                <w:rFonts w:ascii="Times New Roman" w:hAnsi="Times New Roman" w:eastAsia="Times New Roman"/>
-                <w:b w:val="0"/>
-                <w:i w:val="0"/>
-                <w:color w:val="000000"/>
-                <w:sz w:val="16"/>
-              </w:rPr>
-              <w:t>54.2</w:t>
-            </w:r>
-          </w:p>
-        </w:tc>
-        <w:tc>
-          <w:tcPr>
-            <w:tcW w:type="dxa" w:w="1224"/>
-            <w:tcBorders>
-              <w:top w:val="single" w:sz="4" w:color="666666"/>
-              <w:left w:val="single" w:sz="4" w:color="666666"/>
-              <w:bottom w:val="single" w:sz="4" w:color="666666"/>
-              <w:right w:val="single" w:sz="4" w:color="666666"/>
-            </w:tcBorders>
-          </w:tcPr>
-          <w:p>
-            <w:pPr>
-              <w:spacing w:line="240" w:lineRule="auto" w:after="0" w:before="0"/>
-              <w:jc w:val="center"/>
-            </w:pPr>
-            <w:r/>
-            <w:r>
-              <w:rPr>
-                <w:rFonts w:ascii="Times New Roman" w:hAnsi="Times New Roman" w:eastAsia="Times New Roman"/>
-                <w:b w:val="0"/>
-                <w:i w:val="0"/>
-                <w:color w:val="000000"/>
-                <w:sz w:val="16"/>
-              </w:rPr>
-              <w:t>79 / 1650</w:t>
-            </w:r>
-          </w:p>
-        </w:tc>
-        <w:tc>
-          <w:tcPr>
-            <w:tcW w:type="dxa" w:w="1224"/>
-            <w:tcBorders>
-              <w:top w:val="single" w:sz="4" w:color="666666"/>
-              <w:left w:val="single" w:sz="4" w:color="666666"/>
-              <w:bottom w:val="single" w:sz="4" w:color="666666"/>
-              <w:right w:val="single" w:sz="4" w:color="666666"/>
-            </w:tcBorders>
-          </w:tcPr>
-          <w:p>
-            <w:pPr>
-              <w:spacing w:line="240" w:lineRule="auto" w:after="0" w:before="0"/>
-              <w:jc w:val="center"/>
-            </w:pPr>
-            <w:r/>
-            <w:r>
-              <w:rPr>
-                <w:rFonts w:ascii="Times New Roman" w:hAnsi="Times New Roman" w:eastAsia="Times New Roman"/>
-                <w:b w:val="0"/>
-                <w:i w:val="0"/>
-                <w:color w:val="000000"/>
-                <w:sz w:val="16"/>
-              </w:rPr>
-              <w:t>59,253</w:t>
-            </w:r>
-          </w:p>
-        </w:tc>
-        <w:tc>
-          <w:tcPr>
-            <w:tcW w:type="dxa" w:w="691"/>
-            <w:tcBorders>
-              <w:top w:val="single" w:sz="4" w:color="666666"/>
-              <w:left w:val="single" w:sz="4" w:color="666666"/>
-              <w:bottom w:val="single" w:sz="4" w:color="666666"/>
-              <w:right w:val="single" w:sz="4" w:color="666666"/>
-            </w:tcBorders>
-          </w:tcPr>
-          <w:p>
-            <w:pPr>
-              <w:spacing w:line="240" w:lineRule="auto" w:after="0" w:before="0"/>
-              <w:jc w:val="center"/>
-            </w:pPr>
-            <w:r/>
-            <w:r>
-              <w:rPr>
-                <w:rFonts w:ascii="Times New Roman" w:hAnsi="Times New Roman" w:eastAsia="Times New Roman"/>
-                <w:b w:val="0"/>
-                <w:i w:val="0"/>
-                <w:color w:val="000000"/>
-                <w:sz w:val="16"/>
-              </w:rPr>
-              <w:t>—</w:t>
-            </w:r>
-          </w:p>
-        </w:tc>
-        <w:tc>
-          <w:tcPr>
-            <w:tcW w:type="dxa" w:w="1123"/>
-            <w:tcBorders>
-              <w:top w:val="single" w:sz="4" w:color="666666"/>
-              <w:left w:val="single" w:sz="4" w:color="666666"/>
-              <w:bottom w:val="single" w:sz="4" w:color="666666"/>
-              <w:right w:val="single" w:sz="4" w:color="666666"/>
-            </w:tcBorders>
-          </w:tcPr>
-          <w:p>
-            <w:pPr>
-              <w:spacing w:line="240" w:lineRule="auto" w:after="0" w:before="0"/>
-              <w:jc w:val="center"/>
-            </w:pPr>
-            <w:r/>
-            <w:r>
-              <w:rPr>
-                <w:rFonts w:ascii="Times New Roman" w:hAnsi="Times New Roman" w:eastAsia="Times New Roman"/>
-                <w:b w:val="0"/>
-                <w:i w:val="0"/>
-                <w:color w:val="000000"/>
-                <w:sz w:val="16"/>
-              </w:rPr>
-              <w:t>—</w:t>
-            </w:r>
-          </w:p>
-        </w:tc>
-        <w:tc>
-          <w:tcPr>
-            <w:tcW w:type="dxa" w:w="792"/>
-            <w:tcBorders>
-              <w:top w:val="single" w:sz="4" w:color="666666"/>
-              <w:left w:val="single" w:sz="4" w:color="666666"/>
-              <w:bottom w:val="single" w:sz="4" w:color="666666"/>
-              <w:right w:val="single" w:sz="4" w:color="666666"/>
-            </w:tcBorders>
-          </w:tcPr>
-          <w:p>
-            <w:pPr>
-              <w:spacing w:line="240" w:lineRule="auto" w:after="0" w:before="0"/>
-              <w:jc w:val="center"/>
-            </w:pPr>
-            <w:r/>
-            <w:r>
-              <w:rPr>
-                <w:rFonts w:ascii="Times New Roman" w:hAnsi="Times New Roman" w:eastAsia="Times New Roman"/>
-                <w:b w:val="0"/>
-                <w:i w:val="0"/>
-                <w:color w:val="000000"/>
-                <w:sz w:val="16"/>
-              </w:rPr>
-              <w:t>—</w:t>
-            </w:r>
-          </w:p>
-        </w:tc>
-        <w:tc>
-          <w:tcPr>
-            <w:tcW w:type="dxa" w:w="835"/>
-            <w:tcBorders>
-              <w:top w:val="single" w:sz="4" w:color="666666"/>
-              <w:left w:val="single" w:sz="4" w:color="666666"/>
-              <w:bottom w:val="single" w:sz="4" w:color="666666"/>
-              <w:right w:val="single" w:sz="4" w:color="666666"/>
-            </w:tcBorders>
-          </w:tcPr>
-          <w:p>
-            <w:pPr>
-              <w:spacing w:line="240" w:lineRule="auto" w:after="0" w:before="0"/>
-              <w:jc w:val="center"/>
-            </w:pPr>
-            <w:r/>
-            <w:r>
-              <w:rPr>
-                <w:rFonts w:ascii="Times New Roman" w:hAnsi="Times New Roman" w:eastAsia="Times New Roman"/>
-                <w:b w:val="0"/>
-                <w:i w:val="0"/>
-                <w:color w:val="000000"/>
-                <w:sz w:val="16"/>
-              </w:rPr>
-              <w:t>—</w:t>
-            </w:r>
-          </w:p>
-        </w:tc>
-        <w:tc>
-          <w:tcPr>
-            <w:tcW w:type="dxa" w:w="835"/>
-            <w:tcBorders>
-              <w:top w:val="single" w:sz="4" w:color="666666"/>
-              <w:left w:val="single" w:sz="4" w:color="666666"/>
-              <w:bottom w:val="single" w:sz="4" w:color="666666"/>
-              <w:right w:val="single" w:sz="4" w:color="666666"/>
-            </w:tcBorders>
-          </w:tcPr>
-          <w:p>
-            <w:pPr>
-              <w:spacing w:line="240" w:lineRule="auto" w:after="0" w:before="0"/>
-              <w:jc w:val="center"/>
-            </w:pPr>
-            <w:r/>
-            <w:r>
-              <w:rPr>
-                <w:rFonts w:ascii="Times New Roman" w:hAnsi="Times New Roman" w:eastAsia="Times New Roman"/>
-                <w:b w:val="0"/>
-                <w:i w:val="0"/>
-                <w:color w:val="000000"/>
-                <w:sz w:val="16"/>
-              </w:rPr>
-              <w:t>—</w:t>
-            </w:r>
-          </w:p>
-        </w:tc>
-      </w:tr>
-      <w:tr>
-        <w:tc>
-          <w:tcPr>
-            <w:tcW w:type="dxa" w:w="1656"/>
-            <w:tcBorders>
-              <w:top w:val="single" w:sz="4" w:color="666666"/>
-              <w:left w:val="single" w:sz="4" w:color="666666"/>
-              <w:bottom w:val="single" w:sz="4" w:color="666666"/>
-              <w:right w:val="single" w:sz="4" w:color="666666"/>
-            </w:tcBorders>
-          </w:tcPr>
-          <w:p>
-            <w:pPr>
-              <w:spacing w:line="240" w:lineRule="auto" w:after="0" w:before="0"/>
-              <w:jc w:val="left"/>
-            </w:pPr>
-            <w:r/>
-            <w:r>
-              <w:rPr>
-                <w:rFonts w:ascii="Times New Roman" w:hAnsi="Times New Roman" w:eastAsia="Times New Roman"/>
-                <w:b w:val="0"/>
-                <w:i w:val="0"/>
-                <w:color w:val="000000"/>
-                <w:sz w:val="16"/>
-              </w:rPr>
-              <w:t>Proposed KGDI</w:t>
-            </w:r>
-          </w:p>
-        </w:tc>
-        <w:tc>
-          <w:tcPr>
-            <w:tcW w:type="dxa" w:w="792"/>
-            <w:tcBorders>
-              <w:top w:val="single" w:sz="4" w:color="666666"/>
-              <w:left w:val="single" w:sz="4" w:color="666666"/>
-              <w:bottom w:val="single" w:sz="4" w:color="666666"/>
-              <w:right w:val="single" w:sz="4" w:color="666666"/>
-            </w:tcBorders>
-          </w:tcPr>
-          <w:p>
-            <w:pPr>
-              <w:spacing w:line="240" w:lineRule="auto" w:after="0" w:before="0"/>
-              <w:jc w:val="center"/>
-            </w:pPr>
-            <w:r/>
-            <w:r>
-              <w:rPr>
-                <w:rFonts w:ascii="Times New Roman" w:hAnsi="Times New Roman" w:eastAsia="Times New Roman"/>
-                <w:b w:val="0"/>
-                <w:i w:val="0"/>
-                <w:color w:val="000000"/>
-                <w:sz w:val="16"/>
-              </w:rPr>
-              <w:t>20.8</w:t>
-            </w:r>
-          </w:p>
-        </w:tc>
-        <w:tc>
-          <w:tcPr>
-            <w:tcW w:type="dxa" w:w="893"/>
-            <w:tcBorders>
-              <w:top w:val="single" w:sz="4" w:color="666666"/>
-              <w:left w:val="single" w:sz="4" w:color="666666"/>
-              <w:bottom w:val="single" w:sz="4" w:color="666666"/>
-              <w:right w:val="single" w:sz="4" w:color="666666"/>
-            </w:tcBorders>
-          </w:tcPr>
-          <w:p>
-            <w:pPr>
-              <w:spacing w:line="240" w:lineRule="auto" w:after="0" w:before="0"/>
-              <w:jc w:val="center"/>
-            </w:pPr>
-            <w:r/>
-            <w:r>
-              <w:rPr>
-                <w:rFonts w:ascii="Times New Roman" w:hAnsi="Times New Roman" w:eastAsia="Times New Roman"/>
-                <w:b w:val="0"/>
-                <w:i w:val="0"/>
-                <w:color w:val="000000"/>
-                <w:sz w:val="16"/>
-              </w:rPr>
-              <w:t>50.6</w:t>
-            </w:r>
-          </w:p>
-        </w:tc>
-        <w:tc>
-          <w:tcPr>
-            <w:tcW w:type="dxa" w:w="835"/>
+            <w:tcW w:type="dxa" w:w="1512"/>
             <w:tcBorders>
               <w:top w:val="single" w:sz="4" w:color="666666"/>
               <w:left w:val="single" w:sz="4" w:color="666666"/>
@@ -2998,7 +2548,177 @@
                 <w:color w:val="000000"/>
                 <w:sz w:val="16"/>
               </w:rPr>
-              <w:t>1297 / 166</w:t>
+              <w:t>54.2</w:t>
+            </w:r>
+          </w:p>
+        </w:tc>
+        <w:tc>
+          <w:tcPr>
+            <w:tcW w:type="dxa" w:w="1656"/>
+            <w:tcBorders>
+              <w:top w:val="single" w:sz="4" w:color="666666"/>
+              <w:left w:val="single" w:sz="4" w:color="666666"/>
+              <w:bottom w:val="single" w:sz="4" w:color="666666"/>
+              <w:right w:val="single" w:sz="4" w:color="666666"/>
+            </w:tcBorders>
+          </w:tcPr>
+          <w:p>
+            <w:pPr>
+              <w:spacing w:line="240" w:lineRule="auto" w:after="0" w:before="0"/>
+              <w:jc w:val="center"/>
+            </w:pPr>
+            <w:r/>
+            <w:r>
+              <w:rPr>
+                <w:rFonts w:ascii="Times New Roman" w:hAnsi="Times New Roman" w:eastAsia="Times New Roman"/>
+                <w:b w:val="0"/>
+                <w:i w:val="0"/>
+                <w:color w:val="000000"/>
+                <w:sz w:val="16"/>
+              </w:rPr>
+              <w:t>79 / 1650</w:t>
+            </w:r>
+          </w:p>
+        </w:tc>
+        <w:tc>
+          <w:tcPr>
+            <w:tcW w:type="dxa" w:w="1656"/>
+            <w:tcBorders>
+              <w:top w:val="single" w:sz="4" w:color="666666"/>
+              <w:left w:val="single" w:sz="4" w:color="666666"/>
+              <w:bottom w:val="single" w:sz="4" w:color="666666"/>
+              <w:right w:val="single" w:sz="4" w:color="666666"/>
+            </w:tcBorders>
+          </w:tcPr>
+          <w:p>
+            <w:pPr>
+              <w:spacing w:line="240" w:lineRule="auto" w:after="0" w:before="0"/>
+              <w:jc w:val="center"/>
+            </w:pPr>
+            <w:r/>
+            <w:r>
+              <w:rPr>
+                <w:rFonts w:ascii="Times New Roman" w:hAnsi="Times New Roman" w:eastAsia="Times New Roman"/>
+                <w:b w:val="0"/>
+                <w:i w:val="0"/>
+                <w:color w:val="000000"/>
+                <w:sz w:val="16"/>
+              </w:rPr>
+              <w:t>59,253</w:t>
+            </w:r>
+          </w:p>
+        </w:tc>
+        <w:tc>
+          <w:tcPr>
+            <w:tcW w:type="dxa" w:w="1656"/>
+            <w:tcBorders>
+              <w:top w:val="single" w:sz="4" w:color="666666"/>
+              <w:left w:val="single" w:sz="4" w:color="666666"/>
+              <w:bottom w:val="single" w:sz="4" w:color="666666"/>
+              <w:right w:val="single" w:sz="4" w:color="666666"/>
+            </w:tcBorders>
+          </w:tcPr>
+          <w:p>
+            <w:pPr>
+              <w:spacing w:line="240" w:lineRule="auto" w:after="0" w:before="0"/>
+              <w:jc w:val="center"/>
+            </w:pPr>
+            <w:r/>
+            <w:r>
+              <w:rPr>
+                <w:rFonts w:ascii="Times New Roman" w:hAnsi="Times New Roman" w:eastAsia="Times New Roman"/>
+                <w:b w:val="0"/>
+                <w:i w:val="0"/>
+                <w:color w:val="000000"/>
+                <w:sz w:val="16"/>
+              </w:rPr>
+              <w:t>140,811</w:t>
+            </w:r>
+          </w:p>
+        </w:tc>
+      </w:tr>
+      <w:tr>
+        <w:tc>
+          <w:tcPr>
+            <w:tcW w:type="dxa" w:w="2664"/>
+            <w:tcBorders>
+              <w:top w:val="single" w:sz="4" w:color="666666"/>
+              <w:left w:val="single" w:sz="4" w:color="666666"/>
+              <w:bottom w:val="single" w:sz="4" w:color="666666"/>
+              <w:right w:val="single" w:sz="4" w:color="666666"/>
+            </w:tcBorders>
+          </w:tcPr>
+          <w:p>
+            <w:pPr>
+              <w:spacing w:line="240" w:lineRule="auto" w:after="0" w:before="0"/>
+              <w:jc w:val="left"/>
+            </w:pPr>
+            <w:r/>
+            <w:r>
+              <w:rPr>
+                <w:rFonts w:ascii="Times New Roman" w:hAnsi="Times New Roman" w:eastAsia="Times New Roman"/>
+                <w:b w:val="0"/>
+                <w:i w:val="0"/>
+                <w:color w:val="000000"/>
+                <w:sz w:val="16"/>
+              </w:rPr>
+              <w:t>Proposed KGDI</w:t>
+            </w:r>
+          </w:p>
+        </w:tc>
+        <w:tc>
+          <w:tcPr>
+            <w:tcW w:type="dxa" w:w="1080"/>
+            <w:tcBorders>
+              <w:top w:val="single" w:sz="4" w:color="666666"/>
+              <w:left w:val="single" w:sz="4" w:color="666666"/>
+              <w:bottom w:val="single" w:sz="4" w:color="666666"/>
+              <w:right w:val="single" w:sz="4" w:color="666666"/>
+            </w:tcBorders>
+          </w:tcPr>
+          <w:p>
+            <w:pPr>
+              <w:spacing w:line="240" w:lineRule="auto" w:after="0" w:before="0"/>
+              <w:jc w:val="center"/>
+            </w:pPr>
+            <w:r/>
+            <w:r>
+              <w:rPr>
+                <w:rFonts w:ascii="Times New Roman" w:hAnsi="Times New Roman" w:eastAsia="Times New Roman"/>
+                <w:b w:val="0"/>
+                <w:i w:val="0"/>
+                <w:color w:val="000000"/>
+                <w:sz w:val="16"/>
+              </w:rPr>
+              <w:t>20.8</w:t>
+            </w:r>
+          </w:p>
+        </w:tc>
+        <w:tc>
+          <w:tcPr>
+            <w:tcW w:type="dxa" w:w="1512"/>
+            <w:tcBorders>
+              <w:top w:val="single" w:sz="4" w:color="666666"/>
+              <w:left w:val="single" w:sz="4" w:color="666666"/>
+              <w:bottom w:val="single" w:sz="4" w:color="666666"/>
+              <w:right w:val="single" w:sz="4" w:color="666666"/>
+            </w:tcBorders>
+          </w:tcPr>
+          <w:p>
+            <w:pPr>
+              <w:spacing w:line="240" w:lineRule="auto" w:after="0" w:before="0"/>
+              <w:jc w:val="center"/>
+            </w:pPr>
+            <w:r/>
+            <w:r>
+              <w:rPr>
+                <w:rFonts w:ascii="Times New Roman" w:hAnsi="Times New Roman" w:eastAsia="Times New Roman"/>
+                <w:b w:val="0"/>
+                <w:i w:val="0"/>
+                <w:color w:val="000000"/>
+                <w:sz w:val="16"/>
+              </w:rPr>
+              <w:t>50.6</w:t>
             </w:r>
           </w:p>
         </w:tc>
@@ -3026,13 +2746,13 @@
                 <w:color w:val="000000"/>
                 <w:sz w:val="16"/>
               </w:rPr>
-              <w:t>67,529</w:t>
+              <w:t>56.4</w:t>
             </w:r>
           </w:p>
         </w:tc>
         <w:tc>
           <w:tcPr>
-            <w:tcW w:type="dxa" w:w="691"/>
+            <w:tcW w:type="dxa" w:w="1656"/>
             <w:tcBorders>
               <w:top w:val="single" w:sz="4" w:color="666666"/>
               <w:left w:val="single" w:sz="4" w:color="666666"/>
@@ -3054,13 +2774,13 @@
                 <w:color w:val="000000"/>
                 <w:sz w:val="16"/>
               </w:rPr>
-              <w:t>2,320</w:t>
+              <w:t>1297 / 166</w:t>
             </w:r>
           </w:p>
         </w:tc>
         <w:tc>
           <w:tcPr>
-            <w:tcW w:type="dxa" w:w="1123"/>
+            <w:tcW w:type="dxa" w:w="1656"/>
             <w:tcBorders>
               <w:top w:val="single" w:sz="4" w:color="666666"/>
               <w:left w:val="single" w:sz="4" w:color="666666"/>
@@ -3082,13 +2802,13 @@
                 <w:color w:val="000000"/>
                 <w:sz w:val="16"/>
               </w:rPr>
-              <w:t>[-92, 5397]</w:t>
+              <w:t>67,529</w:t>
             </w:r>
           </w:p>
         </w:tc>
         <w:tc>
           <w:tcPr>
-            <w:tcW w:type="dxa" w:w="792"/>
+            <w:tcW w:type="dxa" w:w="1656"/>
             <w:tcBorders>
               <w:top w:val="single" w:sz="4" w:color="666666"/>
               <w:left w:val="single" w:sz="4" w:color="666666"/>
@@ -3110,63 +2830,7 @@
                 <w:color w:val="000000"/>
                 <w:sz w:val="16"/>
               </w:rPr>
-              <w:t>968/1000</w:t>
-            </w:r>
-          </w:p>
-        </w:tc>
-        <w:tc>
-          <w:tcPr>
-            <w:tcW w:type="dxa" w:w="835"/>
-            <w:tcBorders>
-              <w:top w:val="single" w:sz="4" w:color="666666"/>
-              <w:left w:val="single" w:sz="4" w:color="666666"/>
-              <w:bottom w:val="single" w:sz="4" w:color="666666"/>
-              <w:right w:val="single" w:sz="4" w:color="666666"/>
-            </w:tcBorders>
-          </w:tcPr>
-          <w:p>
-            <w:pPr>
-              <w:spacing w:line="240" w:lineRule="auto" w:after="0" w:before="0"/>
-              <w:jc w:val="center"/>
-            </w:pPr>
-            <w:r/>
-            <w:r>
-              <w:rPr>
-                <w:rFonts w:ascii="Times New Roman" w:hAnsi="Times New Roman" w:eastAsia="Times New Roman"/>
-                <w:b w:val="0"/>
-                <w:i w:val="0"/>
-                <w:color w:val="000000"/>
-                <w:sz w:val="16"/>
-              </w:rPr>
-              <w:t>12.6</w:t>
-            </w:r>
-          </w:p>
-        </w:tc>
-        <w:tc>
-          <w:tcPr>
-            <w:tcW w:type="dxa" w:w="835"/>
-            <w:tcBorders>
-              <w:top w:val="single" w:sz="4" w:color="666666"/>
-              <w:left w:val="single" w:sz="4" w:color="666666"/>
-              <w:bottom w:val="single" w:sz="4" w:color="666666"/>
-              <w:right w:val="single" w:sz="4" w:color="666666"/>
-            </w:tcBorders>
-          </w:tcPr>
-          <w:p>
-            <w:pPr>
-              <w:spacing w:line="240" w:lineRule="auto" w:after="0" w:before="0"/>
-              <w:jc w:val="center"/>
-            </w:pPr>
-            <w:r/>
-            <w:r>
-              <w:rPr>
-                <w:rFonts w:ascii="Times New Roman" w:hAnsi="Times New Roman" w:eastAsia="Times New Roman"/>
-                <w:b w:val="0"/>
-                <w:i w:val="0"/>
-                <w:color w:val="000000"/>
-                <w:sz w:val="16"/>
-              </w:rPr>
-              <w:t>1000/1000</w:t>
+              <w:t>140,839</w:t>
             </w:r>
           </w:p>
         </w:tc>
@@ -3186,7 +2850,7 @@
           <w:color w:val="000000"/>
           <w:sz w:val="20"/>
         </w:rPr>
-        <w:t>Notes: Interv.: intervention rate. HV: high-value churn reach. CI: percentile interval. Resample fractions are not classical p-values. High-value Δ 95% interval [9.3, 16.5] pp.</w:t>
+        <w:t>Notes: Action %: proportion assigned either a retention offer or human review. HV: high-value churn reach. CI: percentile interval. Resample fractions are not classical p-values. Primary KGDI versus cost-aware HV-delta 95% interval: [9.3, 16.5] pp. Matched CLTV-review versus CLTV-offer-only HV-delta interval: [8.8, 15.6] pp.</w:t>
       </w:r>
     </w:p>
     <w:p>
@@ -3203,19 +2867,53 @@
           <w:color w:val="000000"/>
           <w:sz w:val="24"/>
         </w:rPr>
-        <w:t>Component ablation under the same 85/15 split shows why the coverage gain occurs. A CLTV-only review reserve (no entropy filter, no graph residual) produces the same 1297 offers, 166 reviews, 50.6% overall reach, 56.4% high-value reach, and $67,529 proxy as full KGDI (0 of 7043 actions differ). Adding entropy does not change that set. CLTV plus graph residual without entropy yields fewer reviews (101) and lower high-value reach (51.8%). Removing the CLTV gate increases reviews to 305 and drops high-value reach to 47.1%. Setting the economic share to 1.00 returns high-value reach to 44.1%, near cost-aware targeting. The operative mechanism is the reserved high-CLTV review slice. At this nominal point the graph residual is not an incremental routing signal. The residual does not identify model underestimation: positive-residual terciles have low mean probability (0.11-0.17) and observed churn slightly below pᵢ. Graph residual and model disagreement are distinct (correlation -0.29). Fig. 1 shows offers at high calibrated risk and human review almost entirely above the 75th CLTV percentile. Fig. 2 is the two-objective plane. High-value reach is 56.4% for economic shares 0.70-0.90 and falls to 44.1% at share 1.00. The 0.85 point is a convenient minority-review operating point, not a unique optimum. Across 11 scenario perturbations the high-value coverage advantage remained positive, but it was small when review cost was $40 or reviewer accuracy was 0.75. Point-estimate economic superiority changed sign in several scenarios.</w:t>
+        <w:t>Component ablation under the same 85/15 split identifies the operative mechanism. A CLTV-only review reserve produces the same 1297 offers, 166 reviews, 50.6% overall reach, 56.4% high-value reach, and $67,529 proxy as full KGDI (0 of 7043 actions differ). Adding entropy does not change that set. CLTV plus graph residual without entropy yields 101 reviews and 51.8% high-value reach. Removing the CLTV gate increases reviews to 305 and drops high-value reach to 47.1%. Setting the economic share to 1.00 returns high-value reach to 44.1%. The coverage gain is therefore the reserved high-CLTV review slice, not incremental graph-residual routing. Positive-residual terciles have low mean predicted probability (0.11-0.17) and observed churn slightly below pᵢ. Residual and model disagreement are distinct (correlation -0.29; top-decile Jaccard overlap 0.012). The graph is retained as a leak-safe structural diagnostic, not as the source of the decision gain.</w:t>
       </w:r>
     </w:p>
     <w:p>
       <w:pPr>
-        <w:spacing w:after="0" w:before="120" w:lineRule="auto" w:line="240"/>
+        <w:spacing w:after="0" w:before="0" w:lineRule="auto" w:line="480"/>
+        <w:ind w:firstLine="360"/>
+        <w:jc w:val="both"/>
+      </w:pPr>
+      <w:r>
+        <w:rPr>
+          <w:rFonts w:ascii="Times New Roman" w:hAnsi="Times New Roman" w:eastAsia="Times New Roman"/>
+          <w:b w:val="0"/>
+          <w:i w:val="0"/>
+          <w:color w:val="000000"/>
+          <w:sz w:val="24"/>
+        </w:rPr>
+        <w:t>Expected utility is the ex-ante optimisation objective; the net-benefit proxy is a separate ex-post quantity. The exact epsilon-constraint maximum-strategic endpoint reaches 53.48% of expected high-value churn-risk mass while retaining 99.68% of the utility optimum (ex-post high-value reach 56.4%; net-benefit $69,280). The 85/15 heuristic matches that strategic coverage but retains only 93.02% of the utility optimum ($67,529). At the same strategic target the expected-utility gap is about $4260 (63,809 versus 59,549). Across 11 scenario perturbations the high-value coverage advantage remains positive, but it narrows when review is expensive or reviewer accuracy is low, and point-estimate economic superiority changes sign in several scenarios. Setting Se = Sp = 0.50 eliminates all reviews and reverts to the cost-aware offer-only result, showing that the gain depends on informative reviewer performance under the assumed model.</w:t>
+      </w:r>
+    </w:p>
+    <w:p>
+      <w:pPr>
+        <w:spacing w:after="0" w:before="0" w:lineRule="auto" w:line="480"/>
+        <w:ind w:firstLine="360"/>
+        <w:jc w:val="both"/>
+      </w:pPr>
+      <w:r>
+        <w:rPr>
+          <w:rFonts w:ascii="Times New Roman" w:hAnsi="Times New Roman" w:eastAsia="Times New Roman"/>
+          <w:b w:val="0"/>
+          <w:i w:val="0"/>
+          <w:color w:val="000000"/>
+          <w:sz w:val="24"/>
+        </w:rPr>
+        <w:t>Fig. 1 shows offers concentrated at higher calibrated risk, with human review almost entirely above the 75th CLTV percentile. Marker size encodes graph motif risk as an auxiliary structural diagnostic, not as the allocation engine. Fig. 2 reports the post hoc efficiency benchmark on frozen out-of-fold scores. The 85/15 strategic-review heuristic reaches the same maximum strategic-risk coverage shown by the exact endpoint, but with lower expected-utility retention.</w:t>
+      </w:r>
+    </w:p>
+    <w:p>
+      <w:pPr>
+        <w:spacing w:after="0" w:before="40" w:lineRule="auto" w:line="240"/>
         <w:ind w:firstLine="0"/>
         <w:jc w:val="center"/>
       </w:pPr>
       <w:r>
         <w:drawing>
           <wp:inline xmlns:a="http://schemas.openxmlformats.org/drawingml/2006/main" xmlns:pic="http://schemas.openxmlformats.org/drawingml/2006/picture">
-            <wp:extent cx="5760720" cy="4320540"/>
+            <wp:extent cx="2880360" cy="2160270"/>
             <wp:docPr id="1" name="Picture 1"/>
             <wp:cNvGraphicFramePr>
               <a:graphicFrameLocks noChangeAspect="1"/>
@@ -3236,7 +2934,7 @@
                   <pic:spPr>
                     <a:xfrm>
                       <a:off x="0" y="0"/>
-                      <a:ext cx="5760720" cy="4320540"/>
+                      <a:ext cx="2880360" cy="2160270"/>
                     </a:xfrm>
                     <a:prstGeom prst="rect"/>
                   </pic:spPr>
@@ -3249,7 +2947,7 @@
     </w:p>
     <w:p>
       <w:pPr>
-        <w:spacing w:after="240" w:before="120" w:lineRule="auto" w:line="276"/>
+        <w:spacing w:after="80" w:before="40" w:lineRule="auto" w:line="240"/>
         <w:ind w:firstLine="0"/>
         <w:jc w:val="left"/>
       </w:pPr>
@@ -3259,21 +2957,21 @@
           <w:b w:val="0"/>
           <w:i/>
           <w:color w:val="000000"/>
-          <w:sz w:val="22"/>
+          <w:sz w:val="20"/>
         </w:rPr>
-        <w:t>Fig. 1. Knowledge-guided decision map. Horizontal axis: calibrated ensemble churn probability. Vertical axis: CLTV percentile. Marker size encodes graph motif risk. The dotted line is the high-value CLTV quantile (0.75).</w:t>
+        <w:t>Fig. 1. Strategic-value-guided decision map. Horizontal axis: calibrated ensemble churn probability. Vertical axis: CLTV percentile. Marker size encodes graph motif risk as an auxiliary structural diagnostic. The dotted line is the high-value CLTV quantile (0.75).</w:t>
       </w:r>
     </w:p>
     <w:p>
       <w:pPr>
-        <w:spacing w:after="0" w:before="120" w:lineRule="auto" w:line="240"/>
+        <w:spacing w:after="0" w:before="40" w:lineRule="auto" w:line="240"/>
         <w:ind w:firstLine="0"/>
         <w:jc w:val="center"/>
       </w:pPr>
       <w:r>
         <w:drawing>
           <wp:inline xmlns:a="http://schemas.openxmlformats.org/drawingml/2006/main" xmlns:pic="http://schemas.openxmlformats.org/drawingml/2006/picture">
-            <wp:extent cx="5760720" cy="4320540"/>
+            <wp:extent cx="2880360" cy="1904878"/>
             <wp:docPr id="2" name="Picture 2"/>
             <wp:cNvGraphicFramePr>
               <a:graphicFrameLocks noChangeAspect="1"/>
@@ -3294,7 +2992,7 @@
                   <pic:spPr>
                     <a:xfrm>
                       <a:off x="0" y="0"/>
-                      <a:ext cx="5760720" cy="4320540"/>
+                      <a:ext cx="2880360" cy="1904878"/>
                     </a:xfrm>
                     <a:prstGeom prst="rect"/>
                   </pic:spPr>
@@ -3307,7 +3005,7 @@
     </w:p>
     <w:p>
       <w:pPr>
-        <w:spacing w:after="240" w:before="120" w:lineRule="auto" w:line="276"/>
+        <w:spacing w:after="80" w:before="40" w:lineRule="auto" w:line="240"/>
         <w:ind w:firstLine="0"/>
         <w:jc w:val="left"/>
       </w:pPr>
@@ -3317,15 +3015,15 @@
           <w:b w:val="0"/>
           <w:i/>
           <w:color w:val="000000"/>
-          <w:sz w:val="22"/>
+          <w:sz w:val="20"/>
         </w:rPr>
-        <w:t>Fig. 2. Budget-matched tradeoff between the outcome-anchored net-benefit proxy and high-value churn reach. The path traces alternative economic-allocation fractions.</w:t>
+        <w:t>Fig. 2. Exact epsilon-constraint frontier on frozen out-of-fold scores: expected high-value churn-risk mass versus expected utility retained. Observed labels are not used in the optimisation.</w:t>
       </w:r>
     </w:p>
     <w:p>
       <w:pPr>
         <w:pStyle w:val="Heading1"/>
-        <w:spacing w:lineRule="auto" w:line="480" w:after="0" w:before="240"/>
+        <w:spacing w:lineRule="auto" w:line="480" w:after="0" w:before="120"/>
       </w:pPr>
       <w:r>
         <w:rPr>
@@ -3352,13 +3050,13 @@
           <w:color w:val="000000"/>
           <w:sz w:val="24"/>
         </w:rPr>
-        <w:t>Business parameters are simulated. Reviewers are modelled by fixed sensitivity and specificity. One public dataset is used. High-value reach uses the same CLTV threshold that the policy gates on; the result shows that the intended coverage objective is achieved, not that a hidden value segment was discovered. The graph residual does not detect underestimation here and does not change the 0.85 allocation. The bootstrap conditions on frozen OOF scores. External validity requires another cohort or a later time split [1,2].</w:t>
+        <w:t>Business parameters are simulated, reviewers are represented by fixed sensitivity and specificity, and only one public cohort is analysed. High-value reach uses the same CLTV threshold that the policy gates on. The matched CLTV-offer analysis and the epsilon-constraint benchmark are post hoc mechanism and efficiency checks. The graph residual is non-binding at the nominal point. The bootstrap conditions on frozen out-of-fold scores. The 85/15 heuristic is not Pareto-efficient. Reviewer performance, intervention success, and costs would require empirical estimation in deployment. External validity requires another cohort or a temporal split [1,2].</w:t>
       </w:r>
     </w:p>
     <w:p>
       <w:pPr>
         <w:pStyle w:val="Heading1"/>
-        <w:spacing w:lineRule="auto" w:line="480" w:after="0" w:before="240"/>
+        <w:spacing w:lineRule="auto" w:line="480" w:after="0" w:before="120"/>
       </w:pPr>
       <w:r>
         <w:rPr>
@@ -3385,13 +3083,13 @@
           <w:color w:val="000000"/>
           <w:sz w:val="24"/>
         </w:rPr>
-        <w:t>This short communication formulates churn intervention as a constrained decision problem: calibrated risk, a compact service-contract graph, CLTV as strategic priority, scarce review, and a shared budget [3,4,5,11,12,14]. On IBM Telco data, reserving a minority of that budget for high-CLTV review raises high-value churn reach by 12.6 percentage points versus cost-aware targeting (1000/1000 resamples). Overall churn reach stays comparable. The economic proxy is favourable in point estimate (968/1000 resamples) and remains interval-qualified. Ablation attributes the coverage gain to the CLTV review reserve, not to incremental graph-residual routing. That is a decision-support result, not a new classifier.</w:t>
+        <w:t>This short communication formulates customer-churn intervention as a constrained decision problem rather than a classification endpoint. A calibrated ensemble supplies risk; CLTV supplies strategic-value knowledge; scarce human review and a shared expected-cost budget define the operational decision space; and a compact service-contract graph supplies auxiliary structural context [3-5,11,12,14]. On IBM Telco data, the 85/15 strategic-review policy raises high-value churn reach from 43.8% under cost-aware targeting to 56.4% while leaving overall churn reach essentially unchanged. A matched CLTV-reserved offer-only policy reaches only 44.1%; under the stated reviewer model, review routing is the operative mechanism. The economic point estimate favours the policy but remains interval-qualified. Ablation shows that entropy and graph-residual gates do not add incremental routing at the nominal point. The exact epsilon-constraint benchmark reaches the same strategic coverage with better expected-utility retention. The contribution is a budget-constrained decision-support architecture and mechanism analysis, not a new classifier, a claim of graph reasoning, or a claim of economic optimality.</w:t>
       </w:r>
     </w:p>
     <w:p>
       <w:pPr>
         <w:pStyle w:val="Heading1"/>
-        <w:spacing w:lineRule="auto" w:line="480" w:after="0" w:before="240"/>
+        <w:spacing w:lineRule="auto" w:line="480" w:after="0" w:before="120"/>
       </w:pPr>
       <w:r>
         <w:rPr>
@@ -3401,7 +3099,7 @@
           <w:color w:val="000000"/>
           <w:sz w:val="24"/>
         </w:rPr>
-        <w:t>Data Availability</w:t>
+        <w:t>Data Availability and Declarations</w:t>
       </w:r>
     </w:p>
     <w:p>
@@ -3418,145 +3116,13 @@
           <w:color w:val="000000"/>
           <w:sz w:val="24"/>
         </w:rPr>
-        <w:t>The IBM Telco Customer Churn workbook is a public telecommunications benchmark of the same class used in recent peer-reviewed churn studies [1,2,7]. Retention costs, success probabilities, reviewer parameters, margin, horizon, and budget are simulated scenario assumptions. Tables 1-2, Figs. 1-2, and the supplementary ablation, residual, disagreement, and sensitivity files are reproduced from frozen out-of-fold scores by letter_outputs.py and review_analyses.py in https://github.com/drsaikrishnathota1/kbs-churn-decision-intelligence, using results/experiment_a_frozen.</w:t>
+        <w:t>The IBM Telco Customer Churn sample is a public IBM Cognos Analytics benchmark [18]. The raw workbook is not redistributed. Analysis code is available at https://github.com/drsaikrishnathota1/kbs-churn-decision-intelligence. Reproduction requires the IBM sample and main.py to generate leakage-safe out-of-fold scores; experiment_c.py, letter_outputs.py, review_analyses.py, and experiment_b.py regenerate the decision, mechanism, and efficiency analyses. Competing interest: none. Funding: none. Generative AI: AI-assisted tools were used for language drafting, editing, organisation, and formatting; the author reviewed the content and takes full responsibility. Tables and figures were generated from executable code. CRediT: Sai Krishna Thota: Conceptualization, Methodology, Software, Validation, Formal analysis, Investigation, Data curation, Writing - original draft, Writing - review and editing, Visualization.</w:t>
       </w:r>
     </w:p>
     <w:p>
       <w:pPr>
         <w:pStyle w:val="Heading1"/>
-        <w:spacing w:lineRule="auto" w:line="480" w:after="0" w:before="240"/>
-      </w:pPr>
-      <w:r>
-        <w:rPr>
-          <w:rFonts w:ascii="Times New Roman" w:hAnsi="Times New Roman" w:eastAsia="Times New Roman"/>
-          <w:b/>
-          <w:i w:val="0"/>
-          <w:color w:val="000000"/>
-          <w:sz w:val="24"/>
-        </w:rPr>
-        <w:t>Declaration of Competing Interest</w:t>
-      </w:r>
-    </w:p>
-    <w:p>
-      <w:pPr>
-        <w:spacing w:after="0" w:before="0" w:lineRule="auto" w:line="480"/>
-        <w:ind w:firstLine="0"/>
-        <w:jc w:val="both"/>
-      </w:pPr>
-      <w:r>
-        <w:rPr>
-          <w:rFonts w:ascii="Times New Roman" w:hAnsi="Times New Roman" w:eastAsia="Times New Roman"/>
-          <w:b w:val="0"/>
-          <w:i w:val="0"/>
-          <w:color w:val="000000"/>
-          <w:sz w:val="24"/>
-        </w:rPr>
-        <w:t>The author declares that there are no known competing financial interests or personal relationships that could have appeared to influence the work reported in this manuscript.</w:t>
-      </w:r>
-    </w:p>
-    <w:p>
-      <w:pPr>
-        <w:pStyle w:val="Heading1"/>
-        <w:spacing w:lineRule="auto" w:line="480" w:after="0" w:before="240"/>
-      </w:pPr>
-      <w:r>
-        <w:rPr>
-          <w:rFonts w:ascii="Times New Roman" w:hAnsi="Times New Roman" w:eastAsia="Times New Roman"/>
-          <w:b/>
-          <w:i w:val="0"/>
-          <w:color w:val="000000"/>
-          <w:sz w:val="24"/>
-        </w:rPr>
-        <w:t>Declaration of Generative AI and AI-Assisted Technologies</w:t>
-      </w:r>
-    </w:p>
-    <w:p>
-      <w:pPr>
-        <w:spacing w:after="0" w:before="0" w:lineRule="auto" w:line="480"/>
-        <w:ind w:firstLine="0"/>
-        <w:jc w:val="both"/>
-      </w:pPr>
-      <w:r>
-        <w:rPr>
-          <w:rFonts w:ascii="Times New Roman" w:hAnsi="Times New Roman" w:eastAsia="Times New Roman"/>
-          <w:b w:val="0"/>
-          <w:i w:val="0"/>
-          <w:color w:val="000000"/>
-          <w:sz w:val="24"/>
-        </w:rPr>
-        <w:t>During preparation of this manuscript, AI-assisted tools were used for language drafting, editing, organization, and manuscript formatting support. The author reviewed and edited the content and takes full responsibility for the final manuscript. The experimental data, tables, and figures were generated from executable simulation code and reproducible CSV outputs.</w:t>
-      </w:r>
-    </w:p>
-    <w:p>
-      <w:pPr>
-        <w:pStyle w:val="Heading1"/>
-        <w:spacing w:lineRule="auto" w:line="480" w:after="0" w:before="240"/>
-      </w:pPr>
-      <w:r>
-        <w:rPr>
-          <w:rFonts w:ascii="Times New Roman" w:hAnsi="Times New Roman" w:eastAsia="Times New Roman"/>
-          <w:b/>
-          <w:i w:val="0"/>
-          <w:color w:val="000000"/>
-          <w:sz w:val="24"/>
-        </w:rPr>
-        <w:t>Funding</w:t>
-      </w:r>
-    </w:p>
-    <w:p>
-      <w:pPr>
-        <w:spacing w:after="0" w:before="0" w:lineRule="auto" w:line="480"/>
-        <w:ind w:firstLine="0"/>
-        <w:jc w:val="both"/>
-      </w:pPr>
-      <w:r>
-        <w:rPr>
-          <w:rFonts w:ascii="Times New Roman" w:hAnsi="Times New Roman" w:eastAsia="Times New Roman"/>
-          <w:b w:val="0"/>
-          <w:i w:val="0"/>
-          <w:color w:val="000000"/>
-          <w:sz w:val="24"/>
-        </w:rPr>
-        <w:t>This research received no specific grant from any funding agency in the public, commercial, or not-for-profit sectors.</w:t>
-      </w:r>
-    </w:p>
-    <w:p>
-      <w:pPr>
-        <w:pStyle w:val="Heading1"/>
-        <w:spacing w:lineRule="auto" w:line="480" w:after="0" w:before="240"/>
-      </w:pPr>
-      <w:r>
-        <w:rPr>
-          <w:rFonts w:ascii="Times New Roman" w:hAnsi="Times New Roman" w:eastAsia="Times New Roman"/>
-          <w:b/>
-          <w:i w:val="0"/>
-          <w:color w:val="000000"/>
-          <w:sz w:val="24"/>
-        </w:rPr>
-        <w:t>CRediT Authorship Contribution Statement</w:t>
-      </w:r>
-    </w:p>
-    <w:p>
-      <w:pPr>
-        <w:spacing w:after="0" w:before="0" w:lineRule="auto" w:line="480"/>
-        <w:ind w:firstLine="0"/>
-        <w:jc w:val="both"/>
-      </w:pPr>
-      <w:r>
-        <w:rPr>
-          <w:rFonts w:ascii="Times New Roman" w:hAnsi="Times New Roman" w:eastAsia="Times New Roman"/>
-          <w:b w:val="0"/>
-          <w:i w:val="0"/>
-          <w:color w:val="000000"/>
-          <w:sz w:val="24"/>
-        </w:rPr>
-        <w:t>Sai Krishna Thota: Conceptualization, Methodology, Software, Validation, Formal analysis, Investigation, Data curation, Writing - original draft, Writing - review and editing, Visualization.</w:t>
-      </w:r>
-    </w:p>
-    <w:p>
-      <w:pPr>
-        <w:pStyle w:val="Heading1"/>
-        <w:spacing w:lineRule="auto" w:line="480" w:after="0" w:before="240"/>
+        <w:spacing w:lineRule="auto" w:line="480" w:after="0" w:before="120"/>
       </w:pPr>
       <w:r>
         <w:rPr>
@@ -3571,7 +3137,7 @@
     </w:p>
     <w:p>
       <w:pPr>
-        <w:spacing w:after="120" w:before="0" w:lineRule="auto" w:line="480"/>
+        <w:spacing w:after="0" w:before="0" w:lineRule="auto" w:line="240"/>
         <w:ind w:firstLine="0"/>
         <w:jc w:val="both"/>
       </w:pPr>
@@ -3581,14 +3147,14 @@
           <w:b w:val="0"/>
           <w:i w:val="0"/>
           <w:color w:val="000000"/>
-          <w:sz w:val="24"/>
+          <w:sz w:val="18"/>
         </w:rPr>
         <w:t>[1] Manzoor, A., Qureshi, M. A., Kidney, E., &amp; Longo, L. (2024). A review on machine learning methods for customer churn prediction and recommendations for business practitioners. IEEE Access, 12, 70434-70463. https://doi.org/10.1109/ACCESS.2024.3402092</w:t>
       </w:r>
     </w:p>
     <w:p>
       <w:pPr>
-        <w:spacing w:after="120" w:before="0" w:lineRule="auto" w:line="480"/>
+        <w:spacing w:after="0" w:before="0" w:lineRule="auto" w:line="240"/>
         <w:ind w:firstLine="0"/>
         <w:jc w:val="both"/>
       </w:pPr>
@@ -3598,14 +3164,14 @@
           <w:b w:val="0"/>
           <w:i w:val="0"/>
           <w:color w:val="000000"/>
-          <w:sz w:val="24"/>
+          <w:sz w:val="18"/>
         </w:rPr>
         <w:t>[2] Imani, M., Joudaki, M., Beikmohammadi, A., &amp; Arabnia, H. R. (2025). Customer churn prediction: A systematic review of recent advances, trends, and challenges in machine learning and deep learning. Machine Learning and Knowledge Extraction, 7(3), 105. https://doi.org/10.3390/make7030105</w:t>
       </w:r>
     </w:p>
     <w:p>
       <w:pPr>
-        <w:spacing w:after="120" w:before="0" w:lineRule="auto" w:line="480"/>
+        <w:spacing w:after="0" w:before="0" w:lineRule="auto" w:line="240"/>
         <w:ind w:firstLine="0"/>
         <w:jc w:val="both"/>
       </w:pPr>
@@ -3615,14 +3181,14 @@
           <w:b w:val="0"/>
           <w:i w:val="0"/>
           <w:color w:val="000000"/>
-          <w:sz w:val="24"/>
+          <w:sz w:val="18"/>
         </w:rPr>
         <w:t>[3] Shahabikargar, M., Beheshti, A., Mansoor, W., Zhang, X., Foo, E. J., Jolfaei, A., Hanif, A., &amp; Shabani, N. (2025). ChurnKB: A generative AI-enriched knowledge base for customer churn feature engineering. Algorithms, 18(4), 238. https://doi.org/10.3390/a18040238</w:t>
       </w:r>
     </w:p>
     <w:p>
       <w:pPr>
-        <w:spacing w:after="120" w:before="0" w:lineRule="auto" w:line="480"/>
+        <w:spacing w:after="0" w:before="0" w:lineRule="auto" w:line="240"/>
         <w:ind w:firstLine="0"/>
         <w:jc w:val="both"/>
       </w:pPr>
@@ -3632,14 +3198,14 @@
           <w:b w:val="0"/>
           <w:i w:val="0"/>
           <w:color w:val="000000"/>
-          <w:sz w:val="24"/>
+          <w:sz w:val="18"/>
         </w:rPr>
         <w:t>[4] Jiang, P., Liu, Z., Abedin, M. Z., Wang, J., Yang, W., &amp; Dong, Q. (2024). Profit-driven weighted classifier with interpretable ability for customer churn prediction. Omega, 125, 103034. https://doi.org/10.1016/j.omega.2024.103034</w:t>
       </w:r>
     </w:p>
     <w:p>
       <w:pPr>
-        <w:spacing w:after="120" w:before="0" w:lineRule="auto" w:line="480"/>
+        <w:spacing w:after="0" w:before="0" w:lineRule="auto" w:line="240"/>
         <w:ind w:firstLine="0"/>
         <w:jc w:val="both"/>
       </w:pPr>
@@ -3649,14 +3215,14 @@
           <w:b w:val="0"/>
           <w:i w:val="0"/>
           <w:color w:val="000000"/>
-          <w:sz w:val="24"/>
+          <w:sz w:val="18"/>
         </w:rPr>
         <w:t>[5] Feng, Y., Yin, Y., Wang, D., Ignatius, J., Cheng, T. C. E., Marra, M., &amp; Guo, Y. (2024). Enhancing e-commerce customer churn management with a profit- and AUC-focused prescriptive analytics approach. Journal of Business Research, 184, 114872. https://doi.org/10.1016/j.jbusres.2024.114872</w:t>
       </w:r>
     </w:p>
     <w:p>
       <w:pPr>
-        <w:spacing w:after="120" w:before="0" w:lineRule="auto" w:line="480"/>
+        <w:spacing w:after="0" w:before="0" w:lineRule="auto" w:line="240"/>
         <w:ind w:firstLine="0"/>
         <w:jc w:val="both"/>
       </w:pPr>
@@ -3666,14 +3232,14 @@
           <w:b w:val="0"/>
           <w:i w:val="0"/>
           <w:color w:val="000000"/>
-          <w:sz w:val="24"/>
+          <w:sz w:val="18"/>
         </w:rPr>
         <w:t>[6] Rao, C., Xu, Y., Xiao, X., Hu, F., &amp; Goh, M. (2024). Imbalanced customer churn classification using a new multi-strategy collaborative processing method. Expert Systems with Applications, 247, 123251. https://doi.org/10.1016/j.eswa.2024.123251</w:t>
       </w:r>
     </w:p>
     <w:p>
       <w:pPr>
-        <w:spacing w:after="120" w:before="0" w:lineRule="auto" w:line="480"/>
+        <w:spacing w:after="0" w:before="0" w:lineRule="auto" w:line="240"/>
         <w:ind w:firstLine="0"/>
         <w:jc w:val="both"/>
       </w:pPr>
@@ -3683,14 +3249,14 @@
           <w:b w:val="0"/>
           <w:i w:val="0"/>
           <w:color w:val="000000"/>
-          <w:sz w:val="24"/>
+          <w:sz w:val="18"/>
         </w:rPr>
         <w:t>[7] Wang, C., Rao, C., Hu, F., Xiao, X., &amp; Goh, M. (2024). Risk assessment of customer churn in telco using FCLCNN-LSTM model. Expert Systems with Applications, 248, 123352. https://doi.org/10.1016/j.eswa.2024.123352</w:t>
       </w:r>
     </w:p>
     <w:p>
       <w:pPr>
-        <w:spacing w:after="120" w:before="0" w:lineRule="auto" w:line="480"/>
+        <w:spacing w:after="0" w:before="0" w:lineRule="auto" w:line="240"/>
         <w:ind w:firstLine="0"/>
         <w:jc w:val="both"/>
       </w:pPr>
@@ -3700,14 +3266,14 @@
           <w:b w:val="0"/>
           <w:i w:val="0"/>
           <w:color w:val="000000"/>
-          <w:sz w:val="24"/>
+          <w:sz w:val="18"/>
         </w:rPr>
         <w:t>[8] Haddadi, S. J., Farshidvard, A., dos Santos Silva, F., dos Reis, J. C., &amp; Reis, M. S. (2024). Customer churn prediction in imbalanced datasets with resampling methods: A comparative study. Expert Systems with Applications, 246, 123086. https://doi.org/10.1016/j.eswa.2023.123086</w:t>
       </w:r>
     </w:p>
     <w:p>
       <w:pPr>
-        <w:spacing w:after="120" w:before="0" w:lineRule="auto" w:line="480"/>
+        <w:spacing w:after="0" w:before="0" w:lineRule="auto" w:line="240"/>
         <w:ind w:firstLine="0"/>
         <w:jc w:val="both"/>
       </w:pPr>
@@ -3717,14 +3283,14 @@
           <w:b w:val="0"/>
           <w:i w:val="0"/>
           <w:color w:val="000000"/>
-          <w:sz w:val="24"/>
+          <w:sz w:val="18"/>
         </w:rPr>
         <w:t>[9] Joy, U. G., Hoque, K. E., Uddin, M. N., Chowdhury, L., &amp; Park, S.-B. (2024). A big data-driven hybrid model for enhancing streaming service customer retention through churn prediction integrated with explainable AI. IEEE Access, 12, 69130-69150. https://doi.org/10.1109/ACCESS.2024.3401247</w:t>
       </w:r>
     </w:p>
     <w:p>
       <w:pPr>
-        <w:spacing w:after="120" w:before="0" w:lineRule="auto" w:line="480"/>
+        <w:spacing w:after="0" w:before="0" w:lineRule="auto" w:line="240"/>
         <w:ind w:firstLine="0"/>
         <w:jc w:val="both"/>
       </w:pPr>
@@ -3734,14 +3300,14 @@
           <w:b w:val="0"/>
           <w:i w:val="0"/>
           <w:color w:val="000000"/>
-          <w:sz w:val="24"/>
+          <w:sz w:val="18"/>
         </w:rPr>
         <w:t>[10] Poudel, S. S., Pokharel, S., &amp; Timilsina, M. (2024). Explaining customer churn prediction in telecom industry using tabular machine learning models. Machine Learning with Applications, 17, 100567. https://doi.org/10.1016/j.mlwa.2024.100567</w:t>
       </w:r>
     </w:p>
     <w:p>
       <w:pPr>
-        <w:spacing w:after="120" w:before="0" w:lineRule="auto" w:line="480"/>
+        <w:spacing w:after="0" w:before="0" w:lineRule="auto" w:line="240"/>
         <w:ind w:firstLine="0"/>
         <w:jc w:val="both"/>
       </w:pPr>
@@ -3751,14 +3317,14 @@
           <w:b w:val="0"/>
           <w:i w:val="0"/>
           <w:color w:val="000000"/>
-          <w:sz w:val="24"/>
+          <w:sz w:val="18"/>
         </w:rPr>
         <w:t>[11] Văduva, A.-G., Oprea, S. V., Niculae, A.-M., Bâra, A., &amp; Andreescu, A.-I. (2024). Improving churn detection in the banking sector: A machine learning approach with probability calibration techniques. Electronics, 13(22), 4527. https://doi.org/10.3390/electronics13224527</w:t>
       </w:r>
     </w:p>
     <w:p>
       <w:pPr>
-        <w:spacing w:after="120" w:before="0" w:lineRule="auto" w:line="480"/>
+        <w:spacing w:after="0" w:before="0" w:lineRule="auto" w:line="240"/>
         <w:ind w:firstLine="0"/>
         <w:jc w:val="both"/>
       </w:pPr>
@@ -3768,14 +3334,14 @@
           <w:b w:val="0"/>
           <w:i w:val="0"/>
           <w:color w:val="000000"/>
-          <w:sz w:val="24"/>
+          <w:sz w:val="18"/>
         </w:rPr>
         <w:t>[12] Kostopoulos, G., Davrazos, G., &amp; Kotsiantis, S. (2024). Explainable artificial intelligence-based decision support systems: A recent review. Electronics, 13(14), 2842. https://doi.org/10.3390/electronics13142842</w:t>
       </w:r>
     </w:p>
     <w:p>
       <w:pPr>
-        <w:spacing w:after="120" w:before="0" w:lineRule="auto" w:line="480"/>
+        <w:spacing w:after="0" w:before="0" w:lineRule="auto" w:line="240"/>
         <w:ind w:firstLine="0"/>
         <w:jc w:val="both"/>
       </w:pPr>
@@ -3785,14 +3351,14 @@
           <w:b w:val="0"/>
           <w:i w:val="0"/>
           <w:color w:val="000000"/>
-          <w:sz w:val="24"/>
+          <w:sz w:val="18"/>
         </w:rPr>
         <w:t>[13] Guo, Z., Zhou, D., Yu, D., Zhou, Q., Wu, H., &amp; Hao, A. (2024). An ontology-based method for knowledge reuse in the design for maintenance of complex products. Computers in Industry, 161, 104124. https://doi.org/10.1016/j.compind.2024.104124</w:t>
       </w:r>
     </w:p>
     <w:p>
       <w:pPr>
-        <w:spacing w:after="120" w:before="0" w:lineRule="auto" w:line="480"/>
+        <w:spacing w:after="0" w:before="0" w:lineRule="auto" w:line="240"/>
         <w:ind w:firstLine="0"/>
         <w:jc w:val="both"/>
       </w:pPr>
@@ -3802,14 +3368,14 @@
           <w:b w:val="0"/>
           <w:i w:val="0"/>
           <w:color w:val="000000"/>
-          <w:sz w:val="24"/>
+          <w:sz w:val="18"/>
         </w:rPr>
         <w:t>[14] Su, C., Jiang, Q., Han, Y., Wang, T., &amp; He, Q. (2025). Knowledge graph-driven decision support for manufacturing process: A graph neural network-based knowledge reasoning approach. Advanced Engineering Informatics, 64, 103098. https://doi.org/10.1016/j.aei.2024.103098</w:t>
       </w:r>
     </w:p>
     <w:p>
       <w:pPr>
-        <w:spacing w:after="120" w:before="0" w:lineRule="auto" w:line="480"/>
+        <w:spacing w:after="0" w:before="0" w:lineRule="auto" w:line="240"/>
         <w:ind w:firstLine="0"/>
         <w:jc w:val="both"/>
       </w:pPr>
@@ -3819,14 +3385,14 @@
           <w:b w:val="0"/>
           <w:i w:val="0"/>
           <w:color w:val="000000"/>
-          <w:sz w:val="24"/>
+          <w:sz w:val="18"/>
         </w:rPr>
-        <w:t>[15] Greif, L., Hauck, S., Kimmig, A., &amp; Ovtcharova, J. (2025). A knowledge graph framework to support life cycle assessment for sustainable decision-making. Applied Sciences, 15(1), 175. https://doi.org/10.3390/app15010175</w:t>
+        <w:t>[15] Chu, B.-H., Tsai, M.-S., &amp; Ho, C.-S. (2007). Toward a hybrid data mining model for customer retention. Knowledge-Based Systems, 20(8), 703-718. https://doi.org/10.1016/j.knosys.2006.10.003</w:t>
       </w:r>
     </w:p>
     <w:p>
       <w:pPr>
-        <w:spacing w:after="120" w:before="0" w:lineRule="auto" w:line="480"/>
+        <w:spacing w:after="0" w:before="0" w:lineRule="auto" w:line="240"/>
         <w:ind w:firstLine="0"/>
         <w:jc w:val="both"/>
       </w:pPr>
@@ -3836,14 +3402,14 @@
           <w:b w:val="0"/>
           <w:i w:val="0"/>
           <w:color w:val="000000"/>
-          <w:sz w:val="24"/>
+          <w:sz w:val="18"/>
         </w:rPr>
-        <w:t>[16] Park, C., Lee, H., Lee, S., &amp; Jeong, O. (2025). Synergistic joint model of knowledge graph and LLM for enhancing XAI-based clinical decision support systems. Mathematics, 13(6), 949. https://doi.org/10.3390/math13060949</w:t>
+        <w:t>[16] Abbaspour Onari, M., Jahangoshai Rezaee, M., Saberi, M., &amp; Nobile, M. S. (2024). An explainable data-driven decision support framework for strategic customer development. Knowledge-Based Systems, 295, 111761. https://doi.org/10.1016/j.knosys.2024.111761</w:t>
       </w:r>
     </w:p>
     <w:p>
       <w:pPr>
-        <w:spacing w:after="120" w:before="0" w:lineRule="auto" w:line="480"/>
+        <w:spacing w:after="0" w:before="0" w:lineRule="auto" w:line="240"/>
         <w:ind w:firstLine="0"/>
         <w:jc w:val="both"/>
       </w:pPr>
@@ -3853,14 +3419,14 @@
           <w:b w:val="0"/>
           <w:i w:val="0"/>
           <w:color w:val="000000"/>
-          <w:sz w:val="24"/>
+          <w:sz w:val="18"/>
         </w:rPr>
-        <w:t>[17] Marandi, S., Hu, Y.-S., &amp; Modarres, M. (2025). Complex system diagnostics using a knowledge graph-informed and large language model-enhanced framework. Applied Sciences, 15(17), 9428. https://doi.org/10.3390/app15179428</w:t>
+        <w:t>[17] Latorre, P., Meza, A., López-Ospina, H., Verbeke, W., &amp; Pérez, J. (2025). A prescriptive analytics framework for jointly optimizing retention incentives and targeting. Knowledge-Based Systems, 330, 114649. https://doi.org/10.1016/j.knosys.2025.114649</w:t>
       </w:r>
     </w:p>
     <w:p>
       <w:pPr>
-        <w:spacing w:after="120" w:before="0" w:lineRule="auto" w:line="480"/>
+        <w:spacing w:after="0" w:before="0" w:lineRule="auto" w:line="240"/>
         <w:ind w:firstLine="0"/>
         <w:jc w:val="both"/>
       </w:pPr>
@@ -3870,43 +3436,9 @@
           <w:b w:val="0"/>
           <w:i w:val="0"/>
           <w:color w:val="000000"/>
-          <w:sz w:val="24"/>
+          <w:sz w:val="18"/>
         </w:rPr>
-        <w:t>[18] Li, J., Qian, L., Liu, P., &amp; Liu, T. (2024). Construction of legal knowledge graph based on knowledge-enhanced large language models. Information, 15(11), 666. https://doi.org/10.3390/info15110666</w:t>
-      </w:r>
-    </w:p>
-    <w:p>
-      <w:pPr>
-        <w:spacing w:after="120" w:before="0" w:lineRule="auto" w:line="480"/>
-        <w:ind w:firstLine="0"/>
-        <w:jc w:val="both"/>
-      </w:pPr>
-      <w:r>
-        <w:rPr>
-          <w:rFonts w:ascii="Times New Roman" w:hAnsi="Times New Roman" w:eastAsia="Times New Roman"/>
-          <w:b w:val="0"/>
-          <w:i w:val="0"/>
-          <w:color w:val="000000"/>
-          <w:sz w:val="24"/>
-        </w:rPr>
-        <w:t>[19] Yang, Y., Liu, X., Tu, X., Lu, Y., &amp; Wang, Y. (2025). Automating the construction of environmental policy knowledge graph with large language models. Sustainability, 17(22), 10282. https://doi.org/10.3390/su172210282</w:t>
-      </w:r>
-    </w:p>
-    <w:p>
-      <w:pPr>
-        <w:spacing w:after="120" w:before="0" w:lineRule="auto" w:line="480"/>
-        <w:ind w:firstLine="0"/>
-        <w:jc w:val="both"/>
-      </w:pPr>
-      <w:r>
-        <w:rPr>
-          <w:rFonts w:ascii="Times New Roman" w:hAnsi="Times New Roman" w:eastAsia="Times New Roman"/>
-          <w:b w:val="0"/>
-          <w:i w:val="0"/>
-          <w:color w:val="000000"/>
-          <w:sz w:val="24"/>
-        </w:rPr>
-        <w:t>[20] Zhou, Q., Zhou, D., Wang, Y., Guo, Z., &amp; Dai, C. (2024). Knowledge reuse for ontology modelling and application of maintenance motion state sequence. Journal of Industrial Information Integration, 41, 100659. https://doi.org/10.1016/j.jii.2024.100659</w:t>
+        <w:t>[18] IBM Cognos Analytics Samples Team. (2019). Telco customer churn (11.1.3+). IBM Community. https://community.ibm.com/community/user/blogs/steven-macko/2019/07/11/telco-customer-churn-1113</w:t>
       </w:r>
     </w:p>
     <w:sectPr>

</xml_diff>